<commit_message>
Fix table layout, add PDF render of Module 2 design plan
- Force fixed table layout with explicit tblGrid so declared column widths
  are honored; tighten cell margins so traceability IDs do not wrap
- Replace the U+1D48 modifier-letter d in the drag equation, which had no
  glyph in Calibri and rendered incorrectly
- Add PDF output; document lands at 4 pages with Part B at ~3

Co-Authored-By: Claude Opus 5 <noreply@anthropic.com>
Claude-Session: https://claude.ai/code/session_01Pr1KZUwJKr1SG7VKRTVf7C
</commit_message>
<xml_diff>
--- a/module-02/Module_02_Assignment_Design_Plan.docx
+++ b/module-02/Module_02_Assignment_Design_Plan.docx
@@ -202,12 +202,20 @@
         <w:jc w:val="center"/>
         <w:tblLayout w:type="fixed"/>
         <w:tblLook w:firstColumn="1" w:firstRow="1" w:lastColumn="0" w:lastRow="0" w:noHBand="0" w:noVBand="1" w:val="04A0"/>
+        <w:tblCellMar>
+          <w:left w:w="45" w:type="dxa"/>
+          <w:right w:w="45" w:type="dxa"/>
+          <w:top w:w="18" w:type="dxa"/>
+          <w:bottom w:w="18" w:type="dxa"/>
+        </w:tblCellMar>
+        <w:tblLayout w:type="fixed"/>
+        <w:tblW w:w="9864" w:type="dxa"/>
       </w:tblPr>
       <w:tblGrid>
-        <w:gridCol w:w="2448"/>
-        <w:gridCol w:w="2448"/>
-        <w:gridCol w:w="2448"/>
-        <w:gridCol w:w="2448"/>
+        <w:gridCol w:w="691"/>
+        <w:gridCol w:w="3168"/>
+        <w:gridCol w:w="835"/>
+        <w:gridCol w:w="5169"/>
       </w:tblGrid>
       <w:tr>
         <w:trPr>
@@ -215,7 +223,7 @@
         </w:trPr>
         <w:tc>
           <w:tcPr>
-            <w:tcW w:type="dxa" w:w="576"/>
+            <w:tcW w:type="dxa" w:w="691"/>
             <w:shd w:val="clear" w:fill="E8EAED"/>
           </w:tcPr>
           <w:p>
@@ -235,7 +243,7 @@
         </w:tc>
         <w:tc>
           <w:tcPr>
-            <w:tcW w:type="dxa" w:w="3384"/>
+            <w:tcW w:type="dxa" w:w="3168"/>
             <w:shd w:val="clear" w:fill="E8EAED"/>
           </w:tcPr>
           <w:p>
@@ -255,7 +263,7 @@
         </w:tc>
         <w:tc>
           <w:tcPr>
-            <w:tcW w:type="dxa" w:w="720"/>
+            <w:tcW w:type="dxa" w:w="835"/>
             <w:shd w:val="clear" w:fill="E8EAED"/>
           </w:tcPr>
           <w:p>
@@ -275,7 +283,7 @@
         </w:tc>
         <w:tc>
           <w:tcPr>
-            <w:tcW w:type="dxa" w:w="5112"/>
+            <w:tcW w:type="dxa" w:w="5170"/>
             <w:shd w:val="clear" w:fill="E8EAED"/>
           </w:tcPr>
           <w:p>
@@ -297,7 +305,7 @@
       <w:tr>
         <w:tc>
           <w:tcPr>
-            <w:tcW w:type="dxa" w:w="576"/>
+            <w:tcW w:type="dxa" w:w="691"/>
           </w:tcPr>
           <w:p>
             <w:pPr>
@@ -316,7 +324,7 @@
         </w:tc>
         <w:tc>
           <w:tcPr>
-            <w:tcW w:type="dxa" w:w="3384"/>
+            <w:tcW w:type="dxa" w:w="3168"/>
           </w:tcPr>
           <w:p>
             <w:pPr>
@@ -334,7 +342,7 @@
         </w:tc>
         <w:tc>
           <w:tcPr>
-            <w:tcW w:type="dxa" w:w="720"/>
+            <w:tcW w:type="dxa" w:w="835"/>
           </w:tcPr>
           <w:p>
             <w:pPr>
@@ -353,7 +361,7 @@
         </w:tc>
         <w:tc>
           <w:tcPr>
-            <w:tcW w:type="dxa" w:w="5112"/>
+            <w:tcW w:type="dxa" w:w="5170"/>
           </w:tcPr>
           <w:p>
             <w:pPr>
@@ -373,7 +381,7 @@
       <w:tr>
         <w:tc>
           <w:tcPr>
-            <w:tcW w:type="dxa" w:w="576"/>
+            <w:tcW w:type="dxa" w:w="691"/>
           </w:tcPr>
           <w:p>
             <w:pPr>
@@ -384,7 +392,7 @@
         </w:tc>
         <w:tc>
           <w:tcPr>
-            <w:tcW w:type="dxa" w:w="3384"/>
+            <w:tcW w:type="dxa" w:w="3168"/>
           </w:tcPr>
           <w:p>
             <w:pPr>
@@ -395,7 +403,7 @@
         </w:tc>
         <w:tc>
           <w:tcPr>
-            <w:tcW w:type="dxa" w:w="720"/>
+            <w:tcW w:type="dxa" w:w="835"/>
           </w:tcPr>
           <w:p>
             <w:pPr>
@@ -414,7 +422,7 @@
         </w:tc>
         <w:tc>
           <w:tcPr>
-            <w:tcW w:type="dxa" w:w="5112"/>
+            <w:tcW w:type="dxa" w:w="5170"/>
           </w:tcPr>
           <w:p>
             <w:pPr>
@@ -434,7 +442,7 @@
       <w:tr>
         <w:tc>
           <w:tcPr>
-            <w:tcW w:type="dxa" w:w="576"/>
+            <w:tcW w:type="dxa" w:w="691"/>
           </w:tcPr>
           <w:p>
             <w:pPr>
@@ -453,7 +461,7 @@
         </w:tc>
         <w:tc>
           <w:tcPr>
-            <w:tcW w:type="dxa" w:w="3384"/>
+            <w:tcW w:type="dxa" w:w="3168"/>
           </w:tcPr>
           <w:p>
             <w:pPr>
@@ -471,7 +479,7 @@
         </w:tc>
         <w:tc>
           <w:tcPr>
-            <w:tcW w:type="dxa" w:w="720"/>
+            <w:tcW w:type="dxa" w:w="835"/>
           </w:tcPr>
           <w:p>
             <w:pPr>
@@ -490,7 +498,7 @@
         </w:tc>
         <w:tc>
           <w:tcPr>
-            <w:tcW w:type="dxa" w:w="5112"/>
+            <w:tcW w:type="dxa" w:w="5170"/>
           </w:tcPr>
           <w:p>
             <w:pPr>
@@ -510,7 +518,7 @@
       <w:tr>
         <w:tc>
           <w:tcPr>
-            <w:tcW w:type="dxa" w:w="576"/>
+            <w:tcW w:type="dxa" w:w="691"/>
           </w:tcPr>
           <w:p>
             <w:pPr>
@@ -521,7 +529,7 @@
         </w:tc>
         <w:tc>
           <w:tcPr>
-            <w:tcW w:type="dxa" w:w="3384"/>
+            <w:tcW w:type="dxa" w:w="3168"/>
           </w:tcPr>
           <w:p>
             <w:pPr>
@@ -532,7 +540,7 @@
         </w:tc>
         <w:tc>
           <w:tcPr>
-            <w:tcW w:type="dxa" w:w="720"/>
+            <w:tcW w:type="dxa" w:w="835"/>
           </w:tcPr>
           <w:p>
             <w:pPr>
@@ -551,7 +559,7 @@
         </w:tc>
         <w:tc>
           <w:tcPr>
-            <w:tcW w:type="dxa" w:w="5112"/>
+            <w:tcW w:type="dxa" w:w="5170"/>
           </w:tcPr>
           <w:p>
             <w:pPr>
@@ -571,7 +579,7 @@
       <w:tr>
         <w:tc>
           <w:tcPr>
-            <w:tcW w:type="dxa" w:w="576"/>
+            <w:tcW w:type="dxa" w:w="691"/>
           </w:tcPr>
           <w:p>
             <w:pPr>
@@ -590,7 +598,7 @@
         </w:tc>
         <w:tc>
           <w:tcPr>
-            <w:tcW w:type="dxa" w:w="3384"/>
+            <w:tcW w:type="dxa" w:w="3168"/>
           </w:tcPr>
           <w:p>
             <w:pPr>
@@ -608,7 +616,7 @@
         </w:tc>
         <w:tc>
           <w:tcPr>
-            <w:tcW w:type="dxa" w:w="720"/>
+            <w:tcW w:type="dxa" w:w="835"/>
           </w:tcPr>
           <w:p>
             <w:pPr>
@@ -627,7 +635,7 @@
         </w:tc>
         <w:tc>
           <w:tcPr>
-            <w:tcW w:type="dxa" w:w="5112"/>
+            <w:tcW w:type="dxa" w:w="5170"/>
           </w:tcPr>
           <w:p>
             <w:pPr>
@@ -866,7 +874,7 @@
         <w:rPr>
           <w:rFonts w:ascii="Calibri" w:hAnsi="Calibri"/>
         </w:rPr>
-        <w:t xml:space="preserve"> The canopy is a sail mounted above the occupant’s CG, so it adds both a lateral force and a long moment arm. Sizing to F = ½ρv²CᵈA with A ≈ 0.5 m², Cᵈ ≈ 1.2 and ρ = 1.225 kg/m³ gives roughly 37 N at 10 m/s (22 mph) applied near 1.4 m height — a tipping moment large enough to threaten the ISO 7176-1 stability margin. This analysis sets the auto-stow threshold in DI-2.2 and drives mast placement, so it belongs on the critical path rather than in a late design check.</w:t>
+        <w:t xml:space="preserve"> The canopy is a sail mounted above the occupant’s CG, so it adds both a lateral force and a long moment arm. Sizing to F = ½ρv²C_dA with A ≈ 0.5 m², C_d ≈ 1.2 and ρ = 1.225 kg/m³ gives roughly 37 N at 10 m/s (22 mph) applied near 1.4 m height — a tipping moment large enough to threaten the ISO 7176-1 stability margin. This analysis sets the auto-stow threshold in DI-2.2 and drives mast placement, so it belongs on the critical path rather than in a late design check.</w:t>
       </w:r>
     </w:p>
     <w:p>
@@ -1034,11 +1042,19 @@
         <w:jc w:val="center"/>
         <w:tblLayout w:type="fixed"/>
         <w:tblLook w:firstColumn="1" w:firstRow="1" w:lastColumn="0" w:lastRow="0" w:noHBand="0" w:noVBand="1" w:val="04A0"/>
+        <w:tblCellMar>
+          <w:left w:w="45" w:type="dxa"/>
+          <w:right w:w="45" w:type="dxa"/>
+          <w:top w:w="18" w:type="dxa"/>
+          <w:bottom w:w="18" w:type="dxa"/>
+        </w:tblCellMar>
+        <w:tblLayout w:type="fixed"/>
+        <w:tblW w:w="9864" w:type="dxa"/>
       </w:tblPr>
       <w:tblGrid>
-        <w:gridCol w:w="3264"/>
-        <w:gridCol w:w="3264"/>
-        <w:gridCol w:w="3264"/>
+        <w:gridCol w:w="864"/>
+        <w:gridCol w:w="1152"/>
+        <w:gridCol w:w="7848"/>
       </w:tblGrid>
       <w:tr>
         <w:trPr>
@@ -1046,7 +1062,7 @@
         </w:trPr>
         <w:tc>
           <w:tcPr>
-            <w:tcW w:type="dxa" w:w="792"/>
+            <w:tcW w:type="dxa" w:w="864"/>
             <w:shd w:val="clear" w:fill="E8EAED"/>
           </w:tcPr>
           <w:p>
@@ -1066,7 +1082,7 @@
         </w:tc>
         <w:tc>
           <w:tcPr>
-            <w:tcW w:type="dxa" w:w="1224"/>
+            <w:tcW w:type="dxa" w:w="1152"/>
             <w:shd w:val="clear" w:fill="E8EAED"/>
           </w:tcPr>
           <w:p>
@@ -1086,7 +1102,7 @@
         </w:tc>
         <w:tc>
           <w:tcPr>
-            <w:tcW w:type="dxa" w:w="7776"/>
+            <w:tcW w:type="dxa" w:w="7848"/>
             <w:shd w:val="clear" w:fill="E8EAED"/>
           </w:tcPr>
           <w:p>
@@ -1108,7 +1124,7 @@
       <w:tr>
         <w:tc>
           <w:tcPr>
-            <w:tcW w:type="dxa" w:w="792"/>
+            <w:tcW w:type="dxa" w:w="864"/>
           </w:tcPr>
           <w:p>
             <w:pPr>
@@ -1127,7 +1143,7 @@
         </w:tc>
         <w:tc>
           <w:tcPr>
-            <w:tcW w:type="dxa" w:w="1224"/>
+            <w:tcW w:type="dxa" w:w="1152"/>
           </w:tcPr>
           <w:p>
             <w:pPr>
@@ -1145,7 +1161,7 @@
         </w:tc>
         <w:tc>
           <w:tcPr>
-            <w:tcW w:type="dxa" w:w="7776"/>
+            <w:tcW w:type="dxa" w:w="7848"/>
           </w:tcPr>
           <w:p>
             <w:pPr>
@@ -1180,7 +1196,7 @@
       <w:tr>
         <w:tc>
           <w:tcPr>
-            <w:tcW w:type="dxa" w:w="792"/>
+            <w:tcW w:type="dxa" w:w="864"/>
           </w:tcPr>
           <w:p>
             <w:pPr>
@@ -1199,7 +1215,7 @@
         </w:tc>
         <w:tc>
           <w:tcPr>
-            <w:tcW w:type="dxa" w:w="1224"/>
+            <w:tcW w:type="dxa" w:w="1152"/>
           </w:tcPr>
           <w:p>
             <w:pPr>
@@ -1217,7 +1233,7 @@
         </w:tc>
         <w:tc>
           <w:tcPr>
-            <w:tcW w:type="dxa" w:w="7776"/>
+            <w:tcW w:type="dxa" w:w="7848"/>
           </w:tcPr>
           <w:p>
             <w:pPr>
@@ -1252,7 +1268,7 @@
       <w:tr>
         <w:tc>
           <w:tcPr>
-            <w:tcW w:type="dxa" w:w="792"/>
+            <w:tcW w:type="dxa" w:w="864"/>
           </w:tcPr>
           <w:p>
             <w:pPr>
@@ -1271,7 +1287,7 @@
         </w:tc>
         <w:tc>
           <w:tcPr>
-            <w:tcW w:type="dxa" w:w="1224"/>
+            <w:tcW w:type="dxa" w:w="1152"/>
           </w:tcPr>
           <w:p>
             <w:pPr>
@@ -1289,7 +1305,7 @@
         </w:tc>
         <w:tc>
           <w:tcPr>
-            <w:tcW w:type="dxa" w:w="7776"/>
+            <w:tcW w:type="dxa" w:w="7848"/>
           </w:tcPr>
           <w:p>
             <w:pPr>
@@ -1500,12 +1516,20 @@
         <w:jc w:val="center"/>
         <w:tblLayout w:type="fixed"/>
         <w:tblLook w:firstColumn="1" w:firstRow="1" w:lastColumn="0" w:lastRow="0" w:noHBand="0" w:noVBand="1" w:val="04A0"/>
+        <w:tblCellMar>
+          <w:left w:w="45" w:type="dxa"/>
+          <w:right w:w="45" w:type="dxa"/>
+          <w:top w:w="18" w:type="dxa"/>
+          <w:bottom w:w="18" w:type="dxa"/>
+        </w:tblCellMar>
+        <w:tblLayout w:type="fixed"/>
+        <w:tblW w:w="9864" w:type="dxa"/>
       </w:tblPr>
       <w:tblGrid>
-        <w:gridCol w:w="2448"/>
-        <w:gridCol w:w="2448"/>
-        <w:gridCol w:w="2448"/>
-        <w:gridCol w:w="2448"/>
+        <w:gridCol w:w="2160"/>
+        <w:gridCol w:w="1080"/>
+        <w:gridCol w:w="1224"/>
+        <w:gridCol w:w="5400"/>
       </w:tblGrid>
       <w:tr>
         <w:trPr>
@@ -1533,7 +1557,7 @@
         </w:tc>
         <w:tc>
           <w:tcPr>
-            <w:tcW w:type="dxa" w:w="1152"/>
+            <w:tcW w:type="dxa" w:w="1080"/>
             <w:shd w:val="clear" w:fill="E8EAED"/>
           </w:tcPr>
           <w:p>
@@ -1553,7 +1577,7 @@
         </w:tc>
         <w:tc>
           <w:tcPr>
-            <w:tcW w:type="dxa" w:w="1152"/>
+            <w:tcW w:type="dxa" w:w="1224"/>
             <w:shd w:val="clear" w:fill="E8EAED"/>
           </w:tcPr>
           <w:p>
@@ -1573,7 +1597,7 @@
         </w:tc>
         <w:tc>
           <w:tcPr>
-            <w:tcW w:type="dxa" w:w="5328"/>
+            <w:tcW w:type="dxa" w:w="5400"/>
             <w:shd w:val="clear" w:fill="E8EAED"/>
           </w:tcPr>
           <w:p>
@@ -1613,7 +1637,7 @@
         </w:tc>
         <w:tc>
           <w:tcPr>
-            <w:tcW w:type="dxa" w:w="1152"/>
+            <w:tcW w:type="dxa" w:w="1080"/>
           </w:tcPr>
           <w:p>
             <w:pPr>
@@ -1631,7 +1655,7 @@
         </w:tc>
         <w:tc>
           <w:tcPr>
-            <w:tcW w:type="dxa" w:w="1152"/>
+            <w:tcW w:type="dxa" w:w="1224"/>
           </w:tcPr>
           <w:p>
             <w:pPr>
@@ -1649,7 +1673,7 @@
         </w:tc>
         <w:tc>
           <w:tcPr>
-            <w:tcW w:type="dxa" w:w="5328"/>
+            <w:tcW w:type="dxa" w:w="5400"/>
           </w:tcPr>
           <w:p>
             <w:pPr>
@@ -1695,7 +1719,7 @@
         </w:tc>
         <w:tc>
           <w:tcPr>
-            <w:tcW w:type="dxa" w:w="1152"/>
+            <w:tcW w:type="dxa" w:w="1080"/>
           </w:tcPr>
           <w:p>
             <w:pPr>
@@ -1713,7 +1737,7 @@
         </w:tc>
         <w:tc>
           <w:tcPr>
-            <w:tcW w:type="dxa" w:w="1152"/>
+            <w:tcW w:type="dxa" w:w="1224"/>
           </w:tcPr>
           <w:p>
             <w:pPr>
@@ -1731,7 +1755,7 @@
         </w:tc>
         <w:tc>
           <w:tcPr>
-            <w:tcW w:type="dxa" w:w="5328"/>
+            <w:tcW w:type="dxa" w:w="5400"/>
           </w:tcPr>
           <w:p>
             <w:pPr>
@@ -1777,7 +1801,7 @@
         </w:tc>
         <w:tc>
           <w:tcPr>
-            <w:tcW w:type="dxa" w:w="1152"/>
+            <w:tcW w:type="dxa" w:w="1080"/>
           </w:tcPr>
           <w:p>
             <w:pPr>
@@ -1795,7 +1819,7 @@
         </w:tc>
         <w:tc>
           <w:tcPr>
-            <w:tcW w:type="dxa" w:w="1152"/>
+            <w:tcW w:type="dxa" w:w="1224"/>
           </w:tcPr>
           <w:p>
             <w:pPr>
@@ -1813,7 +1837,7 @@
         </w:tc>
         <w:tc>
           <w:tcPr>
-            <w:tcW w:type="dxa" w:w="5328"/>
+            <w:tcW w:type="dxa" w:w="5400"/>
           </w:tcPr>
           <w:p>
             <w:pPr>
@@ -1859,7 +1883,7 @@
         </w:tc>
         <w:tc>
           <w:tcPr>
-            <w:tcW w:type="dxa" w:w="1152"/>
+            <w:tcW w:type="dxa" w:w="1080"/>
           </w:tcPr>
           <w:p>
             <w:pPr>
@@ -1877,7 +1901,7 @@
         </w:tc>
         <w:tc>
           <w:tcPr>
-            <w:tcW w:type="dxa" w:w="1152"/>
+            <w:tcW w:type="dxa" w:w="1224"/>
           </w:tcPr>
           <w:p>
             <w:pPr>
@@ -1895,7 +1919,7 @@
         </w:tc>
         <w:tc>
           <w:tcPr>
-            <w:tcW w:type="dxa" w:w="5328"/>
+            <w:tcW w:type="dxa" w:w="5400"/>
           </w:tcPr>
           <w:p>
             <w:pPr>
@@ -1941,7 +1965,7 @@
         </w:tc>
         <w:tc>
           <w:tcPr>
-            <w:tcW w:type="dxa" w:w="1152"/>
+            <w:tcW w:type="dxa" w:w="1080"/>
           </w:tcPr>
           <w:p>
             <w:pPr>
@@ -1959,7 +1983,7 @@
         </w:tc>
         <w:tc>
           <w:tcPr>
-            <w:tcW w:type="dxa" w:w="1152"/>
+            <w:tcW w:type="dxa" w:w="1224"/>
           </w:tcPr>
           <w:p>
             <w:pPr>
@@ -1977,7 +2001,7 @@
         </w:tc>
         <w:tc>
           <w:tcPr>
-            <w:tcW w:type="dxa" w:w="5328"/>
+            <w:tcW w:type="dxa" w:w="5400"/>
           </w:tcPr>
           <w:p>
             <w:pPr>
@@ -2023,7 +2047,7 @@
         </w:tc>
         <w:tc>
           <w:tcPr>
-            <w:tcW w:type="dxa" w:w="1152"/>
+            <w:tcW w:type="dxa" w:w="1080"/>
           </w:tcPr>
           <w:p>
             <w:pPr>
@@ -2041,7 +2065,7 @@
         </w:tc>
         <w:tc>
           <w:tcPr>
-            <w:tcW w:type="dxa" w:w="1152"/>
+            <w:tcW w:type="dxa" w:w="1224"/>
           </w:tcPr>
           <w:p>
             <w:pPr>
@@ -2059,7 +2083,7 @@
         </w:tc>
         <w:tc>
           <w:tcPr>
-            <w:tcW w:type="dxa" w:w="5328"/>
+            <w:tcW w:type="dxa" w:w="5400"/>
           </w:tcPr>
           <w:p>
             <w:pPr>
@@ -2105,7 +2129,7 @@
         </w:tc>
         <w:tc>
           <w:tcPr>
-            <w:tcW w:type="dxa" w:w="1152"/>
+            <w:tcW w:type="dxa" w:w="1080"/>
           </w:tcPr>
           <w:p>
             <w:pPr>
@@ -2123,7 +2147,7 @@
         </w:tc>
         <w:tc>
           <w:tcPr>
-            <w:tcW w:type="dxa" w:w="1152"/>
+            <w:tcW w:type="dxa" w:w="1224"/>
           </w:tcPr>
           <w:p>
             <w:pPr>
@@ -2141,7 +2165,7 @@
         </w:tc>
         <w:tc>
           <w:tcPr>
-            <w:tcW w:type="dxa" w:w="5328"/>
+            <w:tcW w:type="dxa" w:w="5400"/>
           </w:tcPr>
           <w:p>
             <w:pPr>

</xml_diff>

<commit_message>
Rewrite Module 2 plan without tables, tightened to ~2.5 pages
- Replace all three tables with prose and bulleted lists per request
- Restate the need statement in the canonical three-slot form
  (problem / population / outcome) rather than the earlier two-part form
- Consolidate three user needs into two, each carrying two design inputs,
  and fold the per-phase review boilerplate into one shared description
- Cite ISO 14971 in text; it previously appeared in the reference list
  only, which the assignment prohibits
- Part B now measures ~2.5 pages

Co-Authored-By: Claude Opus 5 <noreply@anthropic.com>
Claude-Session: https://claude.ai/code/session_01Pr1KZUwJKr1SG7VKRTVf7C
</commit_message>
<xml_diff>
--- a/module-02/Module_02_Assignment_Design_Plan.docx
+++ b/module-02/Module_02_Assignment_Design_Plan.docx
@@ -19,12 +19,11 @@
     </w:p>
     <w:p>
       <w:pPr>
-        <w:spacing w:after="40"/>
+        <w:spacing w:after="20"/>
       </w:pPr>
       <w:r>
         <w:rPr>
           <w:rFonts w:ascii="Calibri" w:hAnsi="Calibri"/>
-          <w:i/>
           <w:sz w:val="19"/>
         </w:rPr>
         <w:t>585.617 Rehabilitation Engineering  |  Module 2 Assignment  |  [Your Name]  |  [Date]</w:t>
@@ -32,7 +31,7 @@
     </w:p>
     <w:p>
       <w:pPr>
-        <w:spacing w:after="180"/>
+        <w:spacing w:after="160"/>
       </w:pPr>
       <w:r>
         <w:rPr>
@@ -63,7 +62,7 @@
     </w:p>
     <w:p>
       <w:pPr>
-        <w:spacing w:after="80"/>
+        <w:spacing w:after="60"/>
         <w:jc w:val="both"/>
       </w:pPr>
       <w:r>
@@ -84,12 +83,12 @@
           <w:rFonts w:ascii="Calibri" w:hAnsi="Calibri"/>
           <w:i/>
         </w:rPr>
-        <w:t>A way for powered wheelchair users to obtain on-demand overhead protection from sun and precipitation, deployable and stowable independently from the seated position, without compromising the chair’s stability, its dimensional envelope in everyday indoor and vehicle-transport environments, or its range.</w:t>
+        <w:t>A way for full-time powered wheelchair users with limited hand function to control their exposure to sun and precipitation, independently and on demand, so that weather does not determine whether they leave home.</w:t>
       </w:r>
     </w:p>
     <w:p>
       <w:pPr>
-        <w:spacing w:after="80"/>
+        <w:spacing w:after="60"/>
         <w:jc w:val="both"/>
       </w:pPr>
       <w:r>
@@ -103,25 +102,12 @@
         <w:rPr>
           <w:rFonts w:ascii="Calibri" w:hAnsi="Calibri"/>
         </w:rPr>
-        <w:t xml:space="preserve"> The target population is full-time powered wheelchair users. Two characteristics of this population make weather exposure a functional problem rather than a comfort problem. First, individuals with spinal cord injury at or above roughly T6 lose sympathetic control of sudomotor and vasomotor function below the lesion, so they cannot dissipate heat by sweating over most of the body surface and are at elevated risk of hyperthermia under sustained sun exposure [4]. Second, the joystick, controller, and connector housings are the most moisture-vulnerable subsystem of a powered chair, so users routinely forgo travel when rain is forecast. In ICF terms the result is a </w:t>
-      </w:r>
-      <w:r>
-        <w:rPr>
-          <w:rFonts w:ascii="Calibri" w:hAnsi="Calibri"/>
-          <w:i/>
-        </w:rPr>
-        <w:t>participation restriction</w:t>
-      </w:r>
-      <w:r>
-        <w:rPr>
-          <w:rFonts w:ascii="Calibri" w:hAnsi="Calibri"/>
-        </w:rPr>
-        <w:t xml:space="preserve"> produced by an environmental factor rather than by the underlying impairment — precisely the class of problem rehabilitation engineering exists to address. Users also cannot reposition into shade or shelter as quickly as ambulatory people can, and many have limited hand function, so any solution requiring a caregiver to erect it has already failed the need.</w:t>
+        <w:t xml:space="preserve"> Two characteristics of this population make weather exposure a functional problem rather than a comfort problem. First, individuals with spinal cord injury at or above roughly T6 lose sympathetic control of sudomotor and vasomotor function below the lesion, so they cannot dissipate heat by sweating over most of the body surface and are at elevated risk of hyperthermia under sustained sun exposure [4]. Second, the joystick, controller, and connector housings are the most moisture-vulnerable subsystem of a powered chair, so users routinely forgo travel when rain is forecast. In ICF terms the result is a participation restriction produced by an environmental factor rather than by the underlying impairment — precisely the class of problem rehabilitation engineering exists to address. Users also cannot reposition into shelter as quickly as ambulatory people can, and many have limited hand function, so any solution requiring a caregiver to erect it has already failed the need.</w:t>
       </w:r>
     </w:p>
     <w:p>
       <w:pPr>
-        <w:spacing w:after="80"/>
+        <w:spacing w:after="60"/>
         <w:jc w:val="both"/>
       </w:pPr>
       <w:r>
@@ -135,7 +121,7 @@
         <w:rPr>
           <w:rFonts w:ascii="Calibri" w:hAnsi="Calibri"/>
         </w:rPr>
-        <w:t xml:space="preserve"> The task as assigned (“add a retractable awning”) specifies a solution, not a need. Following Dieter and Schmid [3], the statement above is written solution-neutrally so that concept generation is not foreclosed before the design input phase: a canopy is one embodiment, but a deployable hood, an integrated garment, or a controller-enclosure upgrade paired with weather alerting may screen better against the same needs. The plan below carries the retractable awning as the presumptive concept while preserving a genuine concept-screening gate in Phase 2.</w:t>
+        <w:t xml:space="preserve"> The task as assigned (“add a retractable awning”) names a solution, not a need. Following Dieter and Schmid [3], the statement above is written solution-neutrally so that concept generation is not foreclosed before the design input phase: a canopy is one embodiment, but a deployable hood, an integrated garment, or a sealed-controller upgrade paired with weather alerting may screen better against the same need. The plan below carries the retractable awning as the presumptive concept while preserving a genuine concept-screening gate in Phase 2.</w:t>
       </w:r>
     </w:p>
     <w:p>
@@ -158,7 +144,7 @@
     </w:p>
     <w:p>
       <w:pPr>
-        <w:spacing w:after="80"/>
+        <w:spacing w:after="60"/>
         <w:jc w:val="both"/>
       </w:pPr>
       <w:r>
@@ -178,13 +164,13 @@
         <w:rPr>
           <w:rFonts w:ascii="Calibri" w:hAnsi="Calibri"/>
         </w:rPr>
-        <w:t xml:space="preserve"> [1], as required by 21 CFR 820.30 [2]. Because the awning is an accessory to an already-marketed Class II powered wheelchair, the project is executed as a design change carried through the full waterfall, and a change assessment under FDA’s 510(k)-change guidance [11] is an explicit Phase 1 deliverable. All outputs are filed in the Design History File (DHF), and every design review includes at least one individual without direct responsibility for the stage under review, per 21 CFR 820.30(e).</w:t>
+        <w:t xml:space="preserve"> [1], as required by 21 CFR 820.30 [2]. Because the awning is an accessory to an already-marketed Class II powered wheelchair, it is executed as a design change carried through the full waterfall, with a change assessment against the existing 510(k) as a Phase 1 deliverable, and all outputs filed in the Design History File.</w:t>
       </w:r>
     </w:p>
     <w:p>
       <w:pPr>
         <w:keepNext/>
-        <w:spacing w:before="160" w:after="40"/>
+        <w:spacing w:before="100" w:after="40"/>
       </w:pPr>
       <w:r>
         <w:rPr>
@@ -195,468 +181,151 @@
         <w:t>Critical User Needs and Traced Design Inputs</w:t>
       </w:r>
     </w:p>
-    <w:tbl>
-      <w:tblPr>
-        <w:tblStyle w:val="TableGrid"/>
-        <w:tblW w:type="auto" w:w="0"/>
-        <w:jc w:val="center"/>
-        <w:tblLayout w:type="fixed"/>
-        <w:tblLook w:firstColumn="1" w:firstRow="1" w:lastColumn="0" w:lastRow="0" w:noHBand="0" w:noVBand="1" w:val="04A0"/>
-        <w:tblCellMar>
-          <w:left w:w="45" w:type="dxa"/>
-          <w:right w:w="45" w:type="dxa"/>
-          <w:top w:w="18" w:type="dxa"/>
-          <w:bottom w:w="18" w:type="dxa"/>
-        </w:tblCellMar>
-        <w:tblLayout w:type="fixed"/>
-        <w:tblW w:w="9864" w:type="dxa"/>
-      </w:tblPr>
-      <w:tblGrid>
-        <w:gridCol w:w="691"/>
-        <w:gridCol w:w="3168"/>
-        <w:gridCol w:w="835"/>
-        <w:gridCol w:w="5169"/>
-      </w:tblGrid>
-      <w:tr>
-        <w:trPr>
-          <w:tblHeader w:val="true"/>
-        </w:trPr>
-        <w:tc>
-          <w:tcPr>
-            <w:tcW w:type="dxa" w:w="691"/>
-            <w:shd w:val="clear" w:fill="E8EAED"/>
-          </w:tcPr>
-          <w:p>
-            <w:pPr>
-              <w:spacing w:after="20"/>
-            </w:pPr>
-            <w:r/>
-            <w:r>
-              <w:rPr>
-                <w:rFonts w:ascii="Calibri" w:hAnsi="Calibri"/>
-                <w:b/>
-                <w:sz w:val="16"/>
-              </w:rPr>
-              <w:t>ID</w:t>
-            </w:r>
-          </w:p>
-        </w:tc>
-        <w:tc>
-          <w:tcPr>
-            <w:tcW w:type="dxa" w:w="3168"/>
-            <w:shd w:val="clear" w:fill="E8EAED"/>
-          </w:tcPr>
-          <w:p>
-            <w:pPr>
-              <w:spacing w:after="20"/>
-            </w:pPr>
-            <w:r/>
-            <w:r>
-              <w:rPr>
-                <w:rFonts w:ascii="Calibri" w:hAnsi="Calibri"/>
-                <w:b/>
-                <w:sz w:val="16"/>
-              </w:rPr>
-              <w:t>Critical user need</w:t>
-            </w:r>
-          </w:p>
-        </w:tc>
-        <w:tc>
-          <w:tcPr>
-            <w:tcW w:type="dxa" w:w="835"/>
-            <w:shd w:val="clear" w:fill="E8EAED"/>
-          </w:tcPr>
-          <w:p>
-            <w:pPr>
-              <w:spacing w:after="20"/>
-            </w:pPr>
-            <w:r/>
-            <w:r>
-              <w:rPr>
-                <w:rFonts w:ascii="Calibri" w:hAnsi="Calibri"/>
-                <w:b/>
-                <w:sz w:val="16"/>
-              </w:rPr>
-              <w:t>ID</w:t>
-            </w:r>
-          </w:p>
-        </w:tc>
-        <w:tc>
-          <w:tcPr>
-            <w:tcW w:type="dxa" w:w="5170"/>
-            <w:shd w:val="clear" w:fill="E8EAED"/>
-          </w:tcPr>
-          <w:p>
-            <w:pPr>
-              <w:spacing w:after="20"/>
-            </w:pPr>
-            <w:r/>
-            <w:r>
-              <w:rPr>
-                <w:rFonts w:ascii="Calibri" w:hAnsi="Calibri"/>
-                <w:b/>
-                <w:sz w:val="16"/>
-              </w:rPr>
-              <w:t>Critical design input (objective and verifiable)</w:t>
-            </w:r>
-          </w:p>
-        </w:tc>
-      </w:tr>
-      <w:tr>
-        <w:tc>
-          <w:tcPr>
-            <w:tcW w:type="dxa" w:w="691"/>
-          </w:tcPr>
-          <w:p>
-            <w:pPr>
-              <w:spacing w:after="20"/>
-            </w:pPr>
-            <w:r/>
-            <w:r>
-              <w:rPr>
-                <w:rFonts w:ascii="Calibri" w:hAnsi="Calibri"/>
-                <w:b/>
-                <w:sz w:val="16"/>
-              </w:rPr>
-              <w:t>UN-1</w:t>
-            </w:r>
-          </w:p>
-        </w:tc>
-        <w:tc>
-          <w:tcPr>
-            <w:tcW w:type="dxa" w:w="3168"/>
-          </w:tcPr>
-          <w:p>
-            <w:pPr>
-              <w:spacing w:after="20"/>
-            </w:pPr>
-            <w:r/>
-            <w:r>
-              <w:rPr>
-                <w:rFonts w:ascii="Calibri" w:hAnsi="Calibri"/>
-                <w:sz w:val="16"/>
-              </w:rPr>
-              <w:t>The user must be able to deploy and stow the awning without assistance, from the seated position, with impaired hand function and without reaching overhead.</w:t>
-            </w:r>
-          </w:p>
-        </w:tc>
-        <w:tc>
-          <w:tcPr>
-            <w:tcW w:type="dxa" w:w="835"/>
-          </w:tcPr>
-          <w:p>
-            <w:pPr>
-              <w:spacing w:after="20"/>
-            </w:pPr>
-            <w:r/>
-            <w:r>
-              <w:rPr>
-                <w:rFonts w:ascii="Calibri" w:hAnsi="Calibri"/>
-                <w:b/>
-                <w:sz w:val="16"/>
-              </w:rPr>
-              <w:t>DI-1.1</w:t>
-            </w:r>
-          </w:p>
-        </w:tc>
-        <w:tc>
-          <w:tcPr>
-            <w:tcW w:type="dxa" w:w="5170"/>
-          </w:tcPr>
-          <w:p>
-            <w:pPr>
-              <w:spacing w:after="20"/>
-            </w:pPr>
-            <w:r/>
-            <w:r>
-              <w:rPr>
-                <w:rFonts w:ascii="Calibri" w:hAnsi="Calibri"/>
-                <w:sz w:val="16"/>
-              </w:rPr>
-              <w:t>A full deploy or stow cycle shall complete in ≤ 10 s, initiated by a single control requiring ≤ 22 N (5 lbf) of force and no tight grasping, pinching, or twisting of the wrist (ADA §309.4 [6]).</w:t>
-            </w:r>
-          </w:p>
-        </w:tc>
-      </w:tr>
-      <w:tr>
-        <w:tc>
-          <w:tcPr>
-            <w:tcW w:type="dxa" w:w="691"/>
-          </w:tcPr>
-          <w:p>
-            <w:pPr>
-              <w:spacing w:after="20"/>
-            </w:pPr>
-            <w:r/>
-          </w:p>
-        </w:tc>
-        <w:tc>
-          <w:tcPr>
-            <w:tcW w:type="dxa" w:w="3168"/>
-          </w:tcPr>
-          <w:p>
-            <w:pPr>
-              <w:spacing w:after="20"/>
-            </w:pPr>
-            <w:r/>
-          </w:p>
-        </w:tc>
-        <w:tc>
-          <w:tcPr>
-            <w:tcW w:type="dxa" w:w="835"/>
-          </w:tcPr>
-          <w:p>
-            <w:pPr>
-              <w:spacing w:after="20"/>
-            </w:pPr>
-            <w:r/>
-            <w:r>
-              <w:rPr>
-                <w:rFonts w:ascii="Calibri" w:hAnsi="Calibri"/>
-                <w:b/>
-                <w:sz w:val="16"/>
-              </w:rPr>
-              <w:t>DI-1.2</w:t>
-            </w:r>
-          </w:p>
-        </w:tc>
-        <w:tc>
-          <w:tcPr>
-            <w:tcW w:type="dxa" w:w="5170"/>
-          </w:tcPr>
-          <w:p>
-            <w:pPr>
-              <w:spacing w:after="20"/>
-            </w:pPr>
-            <w:r/>
-            <w:r>
-              <w:rPr>
-                <w:rFonts w:ascii="Calibri" w:hAnsi="Calibri"/>
-                <w:sz w:val="16"/>
-              </w:rPr>
-              <w:t>The control shall sit within the seated forward and side reach envelope, require no reach above shoulder height, and be operable single-handed by a user with C6 tetraplegia (tenodesis grasp, no active finger flexion).</w:t>
-            </w:r>
-          </w:p>
-        </w:tc>
-      </w:tr>
-      <w:tr>
-        <w:tc>
-          <w:tcPr>
-            <w:tcW w:type="dxa" w:w="691"/>
-          </w:tcPr>
-          <w:p>
-            <w:pPr>
-              <w:spacing w:after="20"/>
-            </w:pPr>
-            <w:r/>
-            <w:r>
-              <w:rPr>
-                <w:rFonts w:ascii="Calibri" w:hAnsi="Calibri"/>
-                <w:b/>
-                <w:sz w:val="16"/>
-              </w:rPr>
-              <w:t>UN-2</w:t>
-            </w:r>
-          </w:p>
-        </w:tc>
-        <w:tc>
-          <w:tcPr>
-            <w:tcW w:type="dxa" w:w="3168"/>
-          </w:tcPr>
-          <w:p>
-            <w:pPr>
-              <w:spacing w:after="20"/>
-            </w:pPr>
-            <w:r/>
-            <w:r>
-              <w:rPr>
-                <w:rFonts w:ascii="Calibri" w:hAnsi="Calibri"/>
-                <w:sz w:val="16"/>
-              </w:rPr>
-              <w:t>The awning must not prevent the user from going where they normally go, or make the chair feel unsafe — indoors, on ramps, in wind, or during vehicle transport.</w:t>
-            </w:r>
-          </w:p>
-        </w:tc>
-        <w:tc>
-          <w:tcPr>
-            <w:tcW w:type="dxa" w:w="835"/>
-          </w:tcPr>
-          <w:p>
-            <w:pPr>
-              <w:spacing w:after="20"/>
-            </w:pPr>
-            <w:r/>
-            <w:r>
-              <w:rPr>
-                <w:rFonts w:ascii="Calibri" w:hAnsi="Calibri"/>
-                <w:b/>
-                <w:sz w:val="16"/>
-              </w:rPr>
-              <w:t>DI-2.1</w:t>
-            </w:r>
-          </w:p>
-        </w:tc>
-        <w:tc>
-          <w:tcPr>
-            <w:tcW w:type="dxa" w:w="5170"/>
-          </w:tcPr>
-          <w:p>
-            <w:pPr>
-              <w:spacing w:after="20"/>
-            </w:pPr>
-            <w:r/>
-            <w:r>
-              <w:rPr>
-                <w:rFonts w:ascii="Calibri" w:hAnsi="Calibri"/>
-                <w:sz w:val="16"/>
-              </w:rPr>
-              <w:t>Stowed, the accessory shall not alter the chair’s ISO 7176-5 overall length, width, or turning envelope. Deployed, occupied overall height shall not exceed 1500 mm and overall width shall not exceed the base chair’s width.</w:t>
-            </w:r>
-          </w:p>
-        </w:tc>
-      </w:tr>
-      <w:tr>
-        <w:tc>
-          <w:tcPr>
-            <w:tcW w:type="dxa" w:w="691"/>
-          </w:tcPr>
-          <w:p>
-            <w:pPr>
-              <w:spacing w:after="20"/>
-            </w:pPr>
-            <w:r/>
-          </w:p>
-        </w:tc>
-        <w:tc>
-          <w:tcPr>
-            <w:tcW w:type="dxa" w:w="3168"/>
-          </w:tcPr>
-          <w:p>
-            <w:pPr>
-              <w:spacing w:after="20"/>
-            </w:pPr>
-            <w:r/>
-          </w:p>
-        </w:tc>
-        <w:tc>
-          <w:tcPr>
-            <w:tcW w:type="dxa" w:w="835"/>
-          </w:tcPr>
-          <w:p>
-            <w:pPr>
-              <w:spacing w:after="20"/>
-            </w:pPr>
-            <w:r/>
-            <w:r>
-              <w:rPr>
-                <w:rFonts w:ascii="Calibri" w:hAnsi="Calibri"/>
-                <w:b/>
-                <w:sz w:val="16"/>
-              </w:rPr>
-              <w:t>DI-2.2</w:t>
-            </w:r>
-          </w:p>
-        </w:tc>
-        <w:tc>
-          <w:tcPr>
-            <w:tcW w:type="dxa" w:w="5170"/>
-          </w:tcPr>
-          <w:p>
-            <w:pPr>
-              <w:spacing w:after="20"/>
-            </w:pPr>
-            <w:r/>
-            <w:r>
-              <w:rPr>
-                <w:rFonts w:ascii="Calibri" w:hAnsi="Calibri"/>
-                <w:sz w:val="16"/>
-              </w:rPr>
-              <w:t>With the awning deployed, the chair shall meet its baseline ISO 7176-1 static and ISO 7176-2 dynamic stability limits [5], and shall auto-stow above a wind threshold established by analysis and confirmed by test.</w:t>
-            </w:r>
-          </w:p>
-        </w:tc>
-      </w:tr>
-      <w:tr>
-        <w:tc>
-          <w:tcPr>
-            <w:tcW w:type="dxa" w:w="691"/>
-          </w:tcPr>
-          <w:p>
-            <w:pPr>
-              <w:spacing w:after="20"/>
-            </w:pPr>
-            <w:r/>
-            <w:r>
-              <w:rPr>
-                <w:rFonts w:ascii="Calibri" w:hAnsi="Calibri"/>
-                <w:b/>
-                <w:sz w:val="16"/>
-              </w:rPr>
-              <w:t>UN-3</w:t>
-            </w:r>
-          </w:p>
-        </w:tc>
-        <w:tc>
-          <w:tcPr>
-            <w:tcW w:type="dxa" w:w="3168"/>
-          </w:tcPr>
-          <w:p>
-            <w:pPr>
-              <w:spacing w:after="20"/>
-            </w:pPr>
-            <w:r/>
-            <w:r>
-              <w:rPr>
-                <w:rFonts w:ascii="Calibri" w:hAnsi="Calibri"/>
-                <w:sz w:val="16"/>
-              </w:rPr>
-              <w:t>The awning must actually keep sun and rain off the user and off the chair’s electronics.</w:t>
-            </w:r>
-          </w:p>
-        </w:tc>
-        <w:tc>
-          <w:tcPr>
-            <w:tcW w:type="dxa" w:w="835"/>
-          </w:tcPr>
-          <w:p>
-            <w:pPr>
-              <w:spacing w:after="20"/>
-            </w:pPr>
-            <w:r/>
-            <w:r>
-              <w:rPr>
-                <w:rFonts w:ascii="Calibri" w:hAnsi="Calibri"/>
-                <w:b/>
-                <w:sz w:val="16"/>
-              </w:rPr>
-              <w:t>DI-3.1</w:t>
-            </w:r>
-          </w:p>
-        </w:tc>
-        <w:tc>
-          <w:tcPr>
-            <w:tcW w:type="dxa" w:w="5170"/>
-          </w:tcPr>
-          <w:p>
-            <w:pPr>
-              <w:spacing w:after="20"/>
-            </w:pPr>
-            <w:r/>
-            <w:r>
-              <w:rPr>
-                <w:rFonts w:ascii="Calibri" w:hAnsi="Calibri"/>
-                <w:sz w:val="16"/>
-              </w:rPr>
-              <w:t>Canopy fabric shall provide UPF ≥ 50 and hydrostatic head ≥ 1000 mm (ISO 811). Deployed coverage shall shade the occupant’s head, shoulders, and joystick at solar elevations 30°–90°, with no loss of controller function under IPX4 spray [5].</w:t>
-            </w:r>
-          </w:p>
-        </w:tc>
-      </w:tr>
-    </w:tbl>
+    <w:p>
+      <w:pPr>
+        <w:spacing w:after="60"/>
+        <w:jc w:val="both"/>
+      </w:pPr>
+      <w:r>
+        <w:rPr>
+          <w:rFonts w:ascii="Calibri" w:hAnsi="Calibri"/>
+        </w:rPr>
+        <w:t xml:space="preserve">Two critical user needs govern the project. </w:t>
+      </w:r>
+      <w:r>
+        <w:rPr>
+          <w:rFonts w:ascii="Calibri" w:hAnsi="Calibri"/>
+          <w:b/>
+        </w:rPr>
+        <w:t>UN-1:</w:t>
+      </w:r>
+      <w:r>
+        <w:rPr>
+          <w:rFonts w:ascii="Calibri" w:hAnsi="Calibri"/>
+        </w:rPr>
+        <w:t xml:space="preserve"> the user must be able to deploy and stow the protection without assistance, from the seated position, with impaired hand function and without reaching overhead. </w:t>
+      </w:r>
+      <w:r>
+        <w:rPr>
+          <w:rFonts w:ascii="Calibri" w:hAnsi="Calibri"/>
+          <w:b/>
+        </w:rPr>
+        <w:t>UN-2:</w:t>
+      </w:r>
+      <w:r>
+        <w:rPr>
+          <w:rFonts w:ascii="Calibri" w:hAnsi="Calibri"/>
+        </w:rPr>
+        <w:t xml:space="preserve"> the protection must actually keep sun and water off both the occupant and the chair’s electronics, without changing where the user can go or how stable the chair feels. Each is traced to measurable design inputs:</w:t>
+      </w:r>
+    </w:p>
+    <w:p>
+      <w:pPr>
+        <w:pStyle w:val="ListBullet"/>
+        <w:spacing w:after="60"/>
+        <w:ind w:left="403" w:hanging="230"/>
+        <w:jc w:val="both"/>
+      </w:pPr>
+      <w:r>
+        <w:rPr>
+          <w:rFonts w:ascii="Calibri" w:hAnsi="Calibri"/>
+          <w:b/>
+        </w:rPr>
+        <w:t>DI-1.1</w:t>
+      </w:r>
+      <w:r>
+        <w:rPr>
+          <w:rFonts w:ascii="Calibri" w:hAnsi="Calibri"/>
+        </w:rPr>
+        <w:t xml:space="preserve"> (from UN-1) — A full deploy or stow cycle shall complete in ≤ 10 s, initiated by a single control requiring ≤ 22 N (5 lbf) of force and no tight grasping, pinching, or twisting of the wrist, per ADA §309.4 [6].</w:t>
+      </w:r>
+    </w:p>
+    <w:p>
+      <w:pPr>
+        <w:pStyle w:val="ListBullet"/>
+        <w:spacing w:after="60"/>
+        <w:ind w:left="403" w:hanging="230"/>
+        <w:jc w:val="both"/>
+      </w:pPr>
+      <w:r>
+        <w:rPr>
+          <w:rFonts w:ascii="Calibri" w:hAnsi="Calibri"/>
+          <w:b/>
+        </w:rPr>
+        <w:t>DI-1.2</w:t>
+      </w:r>
+      <w:r>
+        <w:rPr>
+          <w:rFonts w:ascii="Calibri" w:hAnsi="Calibri"/>
+        </w:rPr>
+        <w:t xml:space="preserve"> (from UN-1) — The control shall sit within the seated forward and side reach envelope, require no reach above shoulder height, and be operable single-handed by a user with C6 tetraplegia (tenodesis grasp, no active finger flexion).</w:t>
+      </w:r>
+    </w:p>
+    <w:p>
+      <w:pPr>
+        <w:pStyle w:val="ListBullet"/>
+        <w:spacing w:after="60"/>
+        <w:ind w:left="403" w:hanging="230"/>
+        <w:jc w:val="both"/>
+      </w:pPr>
+      <w:r>
+        <w:rPr>
+          <w:rFonts w:ascii="Calibri" w:hAnsi="Calibri"/>
+          <w:b/>
+        </w:rPr>
+        <w:t>DI-2.1</w:t>
+      </w:r>
+      <w:r>
+        <w:rPr>
+          <w:rFonts w:ascii="Calibri" w:hAnsi="Calibri"/>
+        </w:rPr>
+        <w:t xml:space="preserve"> (from UN-2) — Stowed, the accessory shall not alter the chair’s ISO 7176-5 overall length, width, or turning envelope. Deployed, occupied height shall not exceed 1500 mm, width shall not exceed the base chair’s width, and the chair shall meet its baseline ISO 7176-1 and ISO 7176-2 stability limits [5].</w:t>
+      </w:r>
+    </w:p>
+    <w:p>
+      <w:pPr>
+        <w:pStyle w:val="ListBullet"/>
+        <w:spacing w:after="60"/>
+        <w:ind w:left="403" w:hanging="230"/>
+        <w:jc w:val="both"/>
+      </w:pPr>
+      <w:r>
+        <w:rPr>
+          <w:rFonts w:ascii="Calibri" w:hAnsi="Calibri"/>
+          <w:b/>
+        </w:rPr>
+        <w:t>DI-2.2</w:t>
+      </w:r>
+      <w:r>
+        <w:rPr>
+          <w:rFonts w:ascii="Calibri" w:hAnsi="Calibri"/>
+        </w:rPr>
+        <w:t xml:space="preserve"> (from UN-2) — Canopy fabric shall provide UPF ≥ 50 and hydrostatic head ≥ 1000 mm (ISO 811). Deployed coverage shall shade the occupant’s head, shoulders, and joystick at solar elevations of 30° to 90°, with no loss of controller function under IPX4 spray.</w:t>
+      </w:r>
+    </w:p>
+    <w:p>
+      <w:pPr>
+        <w:spacing w:after="60"/>
+        <w:jc w:val="both"/>
+      </w:pPr>
+      <w:r>
+        <w:rPr>
+          <w:rFonts w:ascii="Calibri" w:hAnsi="Calibri"/>
+          <w:b/>
+        </w:rPr>
+        <w:t>Design review structure.</w:t>
+      </w:r>
+      <w:r>
+        <w:rPr>
+          <w:rFonts w:ascii="Calibri" w:hAnsi="Calibri"/>
+        </w:rPr>
+        <w:t xml:space="preserve"> Every gate is chaired by the project engineer and attended by product management, a clinical advisor (PT/OT or ATP), regulatory affairs, quality, manufacturing, and at least one reviewer with no direct responsibility for the stage under review, as 21 CFR 820.30(e) requires. Materials circulate five business days in advance, action items are recorded with owners and due dates, no review closes with an open safety-related action, and minutes and the exit decision are filed in the DHF. What changes from gate to gate is the question asked, the material presented, and the exit criteria.</w:t>
+      </w:r>
+    </w:p>
     <w:p>
       <w:pPr>
         <w:keepNext/>
-        <w:spacing w:before="160" w:after="40"/>
+        <w:spacing w:before="100" w:after="40"/>
       </w:pPr>
       <w:r>
         <w:rPr>
@@ -669,7 +338,7 @@
     </w:p>
     <w:p>
       <w:pPr>
-        <w:spacing w:after="80"/>
+        <w:spacing w:after="60"/>
         <w:jc w:val="both"/>
       </w:pPr>
       <w:r>
@@ -683,7 +352,7 @@
         <w:rPr>
           <w:rFonts w:ascii="Calibri" w:hAnsi="Calibri"/>
         </w:rPr>
-        <w:t xml:space="preserve"> recruit and interview 10–15 powered chair users spanning diagnoses and hand function, plus 3–5 clinicians (PT/OT, ATP, seating clinic); observe use in situ; draft the need statement; build a preliminary hazard list; draft the business case. </w:t>
+        <w:t xml:space="preserve"> interview 10–15 powered chair users spanning diagnoses and hand function plus three to five clinicians; observe use in situ; draft the need statement and a weighted needs list; build a preliminary hazard list. </w:t>
       </w:r>
       <w:r>
         <w:rPr>
@@ -696,20 +365,20 @@
         <w:rPr>
           <w:rFonts w:ascii="Calibri" w:hAnsi="Calibri"/>
         </w:rPr>
-        <w:t xml:space="preserve"> weather-avoidance frequency and consequence; caregiver availability; existing workarounds (umbrella clamps, ponchos); anthropometric and reach data for seated users; competitive and patent landscape; warranty history for moisture-related controller failures. </w:t>
+        <w:t xml:space="preserve"> how often and at what cost users forgo travel in weather; caregiver availability; existing workarounds; seated anthropometric and reach data; competitive and patent landscape; warranty history for moisture-related controller failures. </w:t>
       </w:r>
       <w:r>
         <w:rPr>
           <w:rFonts w:ascii="Calibri" w:hAnsi="Calibri"/>
           <w:i/>
         </w:rPr>
-        <w:t>Design review DR-1 (Conceptual — “Should we build this?”):</w:t>
+        <w:t>Review DR-1</w:t>
       </w:r>
       <w:r>
         <w:rPr>
           <w:rFonts w:ascii="Calibri" w:hAnsi="Calibri"/>
         </w:rPr>
-        <w:t xml:space="preserve"> project engineer, product management, clinical advisor, regulatory affairs, quality, manufacturing, independent reviewer; presenting the need statement, user research summary, competitive and patent landscape, preliminary hazard analysis, and business case. </w:t>
+        <w:t xml:space="preserve"> answers “should we build this?” and presents the need statement, user research summary, patent landscape, preliminary hazard analysis, and business case. </w:t>
       </w:r>
       <w:r>
         <w:rPr>
@@ -722,13 +391,13 @@
         <w:rPr>
           <w:rFonts w:ascii="Calibri" w:hAnsi="Calibri"/>
         </w:rPr>
-        <w:t xml:space="preserve"> user needs list approved and signed; every need attributable to primary research rather than assumption; no unresolved showstopper hazard; funded go decision.</w:t>
+        <w:t xml:space="preserve"> needs list approved and signed; every need traceable to primary research rather than assumption; no unresolved showstopper hazard; funded go decision.</w:t>
       </w:r>
     </w:p>
     <w:p>
       <w:pPr>
         <w:keepNext/>
-        <w:spacing w:before="160" w:after="40"/>
+        <w:spacing w:before="100" w:after="40"/>
       </w:pPr>
       <w:r>
         <w:rPr>
@@ -741,7 +410,7 @@
     </w:p>
     <w:p>
       <w:pPr>
-        <w:spacing w:after="80"/>
+        <w:spacing w:after="60"/>
         <w:jc w:val="both"/>
       </w:pPr>
       <w:r>
@@ -755,7 +424,7 @@
         <w:rPr>
           <w:rFonts w:ascii="Calibri" w:hAnsi="Calibri"/>
         </w:rPr>
-        <w:t xml:space="preserve"> convert every user need into at least one objective, verifiable design input; draft the Product Design Specification; open the ISO 14971 risk management file [8]; perform the 510(k)-change assessment [11]; establish the verification strategy and the human factors plan per IEC 62366-1 and FDA HFE guidance [9]. </w:t>
+        <w:t xml:space="preserve"> translate every user need into at least one measurable design input; draft the Product Design Specification; open the risk management file [8]; complete the 510(k) change assessment; write the verification strategy and the human factors plan [9]. </w:t>
       </w:r>
       <w:r>
         <w:rPr>
@@ -768,20 +437,20 @@
         <w:rPr>
           <w:rFonts w:ascii="Calibri" w:hAnsi="Calibri"/>
         </w:rPr>
-        <w:t xml:space="preserve"> applicable ISO 7176 parts and their acceptance limits [5]; IEC Guide 71 provisions on reach, force, and legibility for older and disabled users [7]; the base chair’s battery and range budget; controller bus capability for actuator integration. </w:t>
+        <w:t xml:space="preserve"> the applicable ISO 7176 parts and their acceptance limits [5]; IEC Guide 71 provisions on reach, force, and legibility for older and disabled users [7]; the base chair’s battery and range budget and controller bus capacity. </w:t>
       </w:r>
       <w:r>
         <w:rPr>
           <w:rFonts w:ascii="Calibri" w:hAnsi="Calibri"/>
           <w:i/>
         </w:rPr>
-        <w:t>Design review DR-2 (Preliminary — “Will it work?”):</w:t>
+        <w:t>Review DR-2</w:t>
       </w:r>
       <w:r>
         <w:rPr>
           <w:rFonts w:ascii="Calibri" w:hAnsi="Calibri"/>
         </w:rPr>
-        <w:t xml:space="preserve"> the Phase 0 attendees plus test engineering and a human factors specialist; presenting the PDS, requirements traceability matrix, risk analysis, verification strategy, and regulatory pathway determination. </w:t>
+        <w:t xml:space="preserve"> answers “will it work?” and presents the PDS, the traceability matrix, the risk analysis, the verification strategy, and the regulatory pathway determination. </w:t>
       </w:r>
       <w:r>
         <w:rPr>
@@ -794,13 +463,13 @@
         <w:rPr>
           <w:rFonts w:ascii="Calibri" w:hAnsi="Calibri"/>
         </w:rPr>
-        <w:t xml:space="preserve"> 100% of user needs traced to at least one design input; every input stated in measurable terms with a named verification method; every hazard assigned a risk control; regulatory pathway documented.</w:t>
+        <w:t xml:space="preserve"> 100% of user needs traced to at least one design input; every input stated in measurable terms with a named verification method; every hazard assigned a risk control.</w:t>
       </w:r>
     </w:p>
     <w:p>
       <w:pPr>
         <w:keepNext/>
-        <w:spacing w:before="160" w:after="40"/>
+        <w:spacing w:before="100" w:after="40"/>
       </w:pPr>
       <w:r>
         <w:rPr>
@@ -813,7 +482,7 @@
     </w:p>
     <w:p>
       <w:pPr>
-        <w:spacing w:after="80"/>
+        <w:spacing w:after="60"/>
         <w:jc w:val="both"/>
       </w:pPr>
       <w:r>
@@ -827,7 +496,7 @@
         <w:rPr>
           <w:rFonts w:ascii="Calibri" w:hAnsi="Calibri"/>
         </w:rPr>
-        <w:t xml:space="preserve"> generate at least six concepts; screen them with a Pugh matrix against the weighted user needs; build functional prototypes of the top two; run the engineering analyses below; freeze the design. </w:t>
+        <w:t xml:space="preserve"> generate at least six concepts; screen them with a Pugh matrix against the weighted needs; prototype the top two; run the analyses below; freeze the design. </w:t>
       </w:r>
       <w:r>
         <w:rPr>
@@ -840,20 +509,7 @@
         <w:rPr>
           <w:rFonts w:ascii="Calibri" w:hAnsi="Calibri"/>
         </w:rPr>
-        <w:t xml:space="preserve"> supplier actuator data, fabric test certificates, and the measured center of gravity of the loaded base chair. </w:t>
-      </w:r>
-      <w:r>
-        <w:rPr>
-          <w:rFonts w:ascii="Calibri" w:hAnsi="Calibri"/>
-          <w:b/>
-        </w:rPr>
-        <w:t>Technical aspects considered at this phase</w:t>
-      </w:r>
-      <w:r>
-        <w:rPr>
-          <w:rFonts w:ascii="Calibri" w:hAnsi="Calibri"/>
-        </w:rPr>
-        <w:t xml:space="preserve"> — two worked examples:</w:t>
+        <w:t xml:space="preserve"> supplier actuator data, fabric test certificates, and the measured center of gravity of the loaded base chair. Two technical aspects dominate this phase:</w:t>
       </w:r>
     </w:p>
     <w:p>
@@ -874,7 +530,7 @@
         <w:rPr>
           <w:rFonts w:ascii="Calibri" w:hAnsi="Calibri"/>
         </w:rPr>
-        <w:t xml:space="preserve"> The canopy is a sail mounted above the occupant’s CG, so it adds both a lateral force and a long moment arm. Sizing to F = ½ρv²C_dA with A ≈ 0.5 m², C_d ≈ 1.2 and ρ = 1.225 kg/m³ gives roughly 37 N at 10 m/s (22 mph) applied near 1.4 m height — a tipping moment large enough to threaten the ISO 7176-1 stability margin. This analysis sets the auto-stow threshold in DI-2.2 and drives mast placement, so it belongs on the critical path rather than in a late design check.</w:t>
+        <w:t xml:space="preserve"> The canopy is a sail mounted above the occupant’s CG, so it adds both a lateral force and a long moment arm. Sizing to F = ½ρv²C_dA with A ≈ 0.5 m², C_d ≈ 1.2 and ρ = 1.225 kg/m³ gives roughly 37 N at 10 m/s (22 mph) applied near 1.4 m height — a tipping moment large enough to threaten the ISO 7176-1 stability margin. This analysis sets the auto-stow threshold and drives mast placement, so it belongs on the critical path rather than in a late design check.</w:t>
       </w:r>
     </w:p>
     <w:p>
@@ -895,32 +551,32 @@
         <w:rPr>
           <w:rFonts w:ascii="Calibri" w:hAnsi="Calibri"/>
         </w:rPr>
-        <w:t xml:space="preserve"> Canopy ribs are traded among 6061-T6 aluminium, glass-filled PA66, and pultruded GFRP against stiffness-to-weight, UV and salt resistance, cost, and recyclability; canopy fabric is traded between solution-dyed acrylic and PU-coated polyester against UPF retention, hydrostatic head, hand feel, and packed volume. Green engineering enters as a stated screening criterion rather than an afterthought: the screen favours a mono-material, mechanically disassemblable canopy assembly and excludes PVC coatings and PFAS-based durable water repellents, accepting a modest weight penalty in exchange for end-of-life recyclability.</w:t>
+        <w:t xml:space="preserve"> Canopy ribs are traded among 6061-T6 aluminium, glass-filled PA66, and pultruded GFRP against stiffness-to-weight, UV resistance, cost, and recyclability; fabric is traded between solution-dyed acrylic and PU-coated polyester against UPF retention, hydrostatic head, and packed volume. Green engineering enters as a stated screening criterion rather than an afterthought: the screen favours a mono-material, mechanically disassemblable canopy and excludes PVC coatings and PFAS-based water repellents, accepting a weight penalty for end-of-life recyclability.</w:t>
       </w:r>
     </w:p>
     <w:p>
       <w:pPr>
-        <w:spacing w:after="80"/>
+        <w:spacing w:after="60"/>
         <w:jc w:val="both"/>
       </w:pPr>
       <w:r>
         <w:rPr>
           <w:rFonts w:ascii="Calibri" w:hAnsi="Calibri"/>
         </w:rPr>
-        <w:t xml:space="preserve">Anthropometric considerations run through both. Seated eye height and overhead clearance set canopy height; ADA §307.4’s 80 in (2030 mm) protruding-object limit and the typical 32 in doorway clear width bound the deployed envelope [6]; accessible-van door heights bound it further; and seated forward and side reach envelopes fix control placement per DI-1.2. </w:t>
+        <w:t xml:space="preserve">Anthropometrics run through both: seated eye height sets canopy height, ADA §307.4’s 80 in (2030 mm) protruding-object limit and the typical 32 in doorway clear width bound the deployed envelope [6], and seated reach envelopes fix control placement per DI-1.2. </w:t>
       </w:r>
       <w:r>
         <w:rPr>
           <w:rFonts w:ascii="Calibri" w:hAnsi="Calibri"/>
           <w:i/>
         </w:rPr>
-        <w:t>Design review DR-2b (concept gate):</w:t>
+        <w:t>Review DR-2b</w:t>
       </w:r>
       <w:r>
         <w:rPr>
           <w:rFonts w:ascii="Calibri" w:hAnsi="Calibri"/>
         </w:rPr>
-        <w:t xml:space="preserve"> engineering, clinical advisor, manufacturing, and the independent reviewer, presenting the Pugh matrix and prototype data. </w:t>
+        <w:t xml:space="preserve"> presents the Pugh matrix and prototype data. </w:t>
       </w:r>
       <w:r>
         <w:rPr>
@@ -933,13 +589,13 @@
         <w:rPr>
           <w:rFonts w:ascii="Calibri" w:hAnsi="Calibri"/>
         </w:rPr>
-        <w:t xml:space="preserve"> one concept selected with documented rationale; the prototype demonstrates feasibility against DI-1.1, DI-2.2, and DI-3.1; no open high-severity risk lacking a control.</w:t>
+        <w:t xml:space="preserve"> one concept selected with documented rationale; feasibility demonstrated against DI-1.1, DI-2.1, and DI-2.2; no open high-severity risk lacking a control.</w:t>
       </w:r>
     </w:p>
     <w:p>
       <w:pPr>
         <w:keepNext/>
-        <w:spacing w:before="160" w:after="40"/>
+        <w:spacing w:before="100" w:after="40"/>
       </w:pPr>
       <w:r>
         <w:rPr>
@@ -952,7 +608,7 @@
     </w:p>
     <w:p>
       <w:pPr>
-        <w:spacing w:after="80"/>
+        <w:spacing w:after="60"/>
         <w:jc w:val="both"/>
       </w:pPr>
       <w:r>
@@ -966,7 +622,7 @@
         <w:rPr>
           <w:rFonts w:ascii="Calibri" w:hAnsi="Calibri"/>
         </w:rPr>
-        <w:t xml:space="preserve"> release drawings, specifications, BOM, actuator control firmware, labelling and IFU; complete the DFMEA; draft the Device Master Record; write and approve every V&amp;V protocol; submit the home-use study protocol for IRB review. </w:t>
+        <w:t xml:space="preserve"> release drawings, specifications, BOM, actuator firmware, labelling and instructions for use; complete the DFMEA; draft the Device Master Record; write and approve every verification and validation protocol; submit the home-use study protocol for IRB review. </w:t>
       </w:r>
       <w:r>
         <w:rPr>
@@ -986,13 +642,13 @@
           <w:rFonts w:ascii="Calibri" w:hAnsi="Calibri"/>
           <w:i/>
         </w:rPr>
-        <w:t>Design review DR-3 (Critical — “Will it be successful?”):</w:t>
+        <w:t>Review DR-3</w:t>
       </w:r>
       <w:r>
         <w:rPr>
           <w:rFonts w:ascii="Calibri" w:hAnsi="Calibri"/>
         </w:rPr>
-        <w:t xml:space="preserve"> the full cross-functional team plus supplier quality and the independent reviewer, presenting the complete output package, DFMEA, essential-output identification, and approved protocols. </w:t>
+        <w:t xml:space="preserve"> answers “will it be successful?” and presents the complete output package, the DFMEA, essential-output identification, and the approved protocols. </w:t>
       </w:r>
       <w:r>
         <w:rPr>
@@ -1005,7 +661,7 @@
         <w:rPr>
           <w:rFonts w:ascii="Calibri" w:hAnsi="Calibri"/>
         </w:rPr>
-        <w:t xml:space="preserve"> every design output traces to a design input; essential outputs identified for manufacturing acceptance; all verification and validation protocols approved </w:t>
+        <w:t xml:space="preserve"> every design output traces to a design input; essential outputs identified for manufacturing acceptance; all protocols approved </w:t>
       </w:r>
       <w:r>
         <w:rPr>
@@ -1024,7 +680,7 @@
     <w:p>
       <w:pPr>
         <w:keepNext/>
-        <w:spacing w:before="160" w:after="40"/>
+        <w:spacing w:before="100" w:after="40"/>
       </w:pPr>
       <w:r>
         <w:rPr>
@@ -1032,341 +688,19 @@
           <w:b/>
           <w:sz w:val="21"/>
         </w:rPr>
-        <w:t>Phase 4 — Verification (Weeks 43–54) — “did we design the device right?”</w:t>
-      </w:r>
-    </w:p>
-    <w:tbl>
-      <w:tblPr>
-        <w:tblStyle w:val="TableGrid"/>
-        <w:tblW w:type="auto" w:w="0"/>
-        <w:jc w:val="center"/>
-        <w:tblLayout w:type="fixed"/>
-        <w:tblLook w:firstColumn="1" w:firstRow="1" w:lastColumn="0" w:lastRow="0" w:noHBand="0" w:noVBand="1" w:val="04A0"/>
-        <w:tblCellMar>
-          <w:left w:w="45" w:type="dxa"/>
-          <w:right w:w="45" w:type="dxa"/>
-          <w:top w:w="18" w:type="dxa"/>
-          <w:bottom w:w="18" w:type="dxa"/>
-        </w:tblCellMar>
-        <w:tblLayout w:type="fixed"/>
-        <w:tblW w:w="9864" w:type="dxa"/>
-      </w:tblPr>
-      <w:tblGrid>
-        <w:gridCol w:w="864"/>
-        <w:gridCol w:w="1152"/>
-        <w:gridCol w:w="7848"/>
-      </w:tblGrid>
-      <w:tr>
-        <w:trPr>
-          <w:tblHeader w:val="true"/>
-        </w:trPr>
-        <w:tc>
-          <w:tcPr>
-            <w:tcW w:type="dxa" w:w="864"/>
-            <w:shd w:val="clear" w:fill="E8EAED"/>
-          </w:tcPr>
-          <w:p>
-            <w:pPr>
-              <w:spacing w:after="20"/>
-            </w:pPr>
-            <w:r/>
-            <w:r>
-              <w:rPr>
-                <w:rFonts w:ascii="Calibri" w:hAnsi="Calibri"/>
-                <w:b/>
-                <w:sz w:val="16"/>
-              </w:rPr>
-              <w:t>ID</w:t>
-            </w:r>
-          </w:p>
-        </w:tc>
-        <w:tc>
-          <w:tcPr>
-            <w:tcW w:type="dxa" w:w="1152"/>
-            <w:shd w:val="clear" w:fill="E8EAED"/>
-          </w:tcPr>
-          <w:p>
-            <w:pPr>
-              <w:spacing w:after="20"/>
-            </w:pPr>
-            <w:r/>
-            <w:r>
-              <w:rPr>
-                <w:rFonts w:ascii="Calibri" w:hAnsi="Calibri"/>
-                <w:b/>
-                <w:sz w:val="16"/>
-              </w:rPr>
-              <w:t>Verifies</w:t>
-            </w:r>
-          </w:p>
-        </w:tc>
-        <w:tc>
-          <w:tcPr>
-            <w:tcW w:type="dxa" w:w="7848"/>
-            <w:shd w:val="clear" w:fill="E8EAED"/>
-          </w:tcPr>
-          <w:p>
-            <w:pPr>
-              <w:spacing w:after="20"/>
-            </w:pPr>
-            <w:r/>
-            <w:r>
-              <w:rPr>
-                <w:rFonts w:ascii="Calibri" w:hAnsi="Calibri"/>
-                <w:b/>
-                <w:sz w:val="16"/>
-              </w:rPr>
-              <w:t>Verification plan</w:t>
-            </w:r>
-          </w:p>
-        </w:tc>
-      </w:tr>
-      <w:tr>
-        <w:tc>
-          <w:tcPr>
-            <w:tcW w:type="dxa" w:w="864"/>
-          </w:tcPr>
-          <w:p>
-            <w:pPr>
-              <w:spacing w:after="20"/>
-            </w:pPr>
-            <w:r/>
-            <w:r>
-              <w:rPr>
-                <w:rFonts w:ascii="Calibri" w:hAnsi="Calibri"/>
-                <w:b/>
-                <w:sz w:val="16"/>
-              </w:rPr>
-              <w:t>VER-1</w:t>
-            </w:r>
-          </w:p>
-        </w:tc>
-        <w:tc>
-          <w:tcPr>
-            <w:tcW w:type="dxa" w:w="1152"/>
-          </w:tcPr>
-          <w:p>
-            <w:pPr>
-              <w:spacing w:after="20"/>
-            </w:pPr>
-            <w:r/>
-            <w:r>
-              <w:rPr>
-                <w:rFonts w:ascii="Calibri" w:hAnsi="Calibri"/>
-                <w:sz w:val="16"/>
-              </w:rPr>
-              <w:t>DI-1.1, DI-1.2</w:t>
-            </w:r>
-          </w:p>
-        </w:tc>
-        <w:tc>
-          <w:tcPr>
-            <w:tcW w:type="dxa" w:w="7848"/>
-          </w:tcPr>
-          <w:p>
-            <w:pPr>
-              <w:spacing w:after="20"/>
-            </w:pPr>
-            <w:r/>
-            <w:r>
-              <w:rPr>
-                <w:rFonts w:ascii="Calibri" w:hAnsi="Calibri"/>
-                <w:sz w:val="16"/>
-              </w:rPr>
-              <w:t xml:space="preserve">Instrumented actuation test on 25 production-equivalent units: a force gauge measures peak control force and a timer measures full deploy and stow cycles across the specified temperature range. </w:t>
-            </w:r>
-            <w:r>
-              <w:rPr>
-                <w:rFonts w:ascii="Calibri" w:hAnsi="Calibri"/>
-                <w:i/>
-                <w:sz w:val="16"/>
-              </w:rPr>
-              <w:t>Acceptance:</w:t>
-            </w:r>
-            <w:r>
-              <w:rPr>
-                <w:rFonts w:ascii="Calibri" w:hAnsi="Calibri"/>
-                <w:sz w:val="16"/>
-              </w:rPr>
-              <w:t xml:space="preserve"> peak force ≤ 22 N and cycle time ≤ 10 s on 100% of units. Followed by a 10,000-cycle durability run built on the ISO 7176-8 fatigue philosophy [5], with force and time re-measured at completion and no loss of function permitted.</w:t>
-            </w:r>
-          </w:p>
-        </w:tc>
-      </w:tr>
-      <w:tr>
-        <w:tc>
-          <w:tcPr>
-            <w:tcW w:type="dxa" w:w="864"/>
-          </w:tcPr>
-          <w:p>
-            <w:pPr>
-              <w:spacing w:after="20"/>
-            </w:pPr>
-            <w:r/>
-            <w:r>
-              <w:rPr>
-                <w:rFonts w:ascii="Calibri" w:hAnsi="Calibri"/>
-                <w:b/>
-                <w:sz w:val="16"/>
-              </w:rPr>
-              <w:t>VER-2</w:t>
-            </w:r>
-          </w:p>
-        </w:tc>
-        <w:tc>
-          <w:tcPr>
-            <w:tcW w:type="dxa" w:w="1152"/>
-          </w:tcPr>
-          <w:p>
-            <w:pPr>
-              <w:spacing w:after="20"/>
-            </w:pPr>
-            <w:r/>
-            <w:r>
-              <w:rPr>
-                <w:rFonts w:ascii="Calibri" w:hAnsi="Calibri"/>
-                <w:sz w:val="16"/>
-              </w:rPr>
-              <w:t>DI-2.1, DI-2.2</w:t>
-            </w:r>
-          </w:p>
-        </w:tc>
-        <w:tc>
-          <w:tcPr>
-            <w:tcW w:type="dxa" w:w="7848"/>
-          </w:tcPr>
-          <w:p>
-            <w:pPr>
-              <w:spacing w:after="20"/>
-            </w:pPr>
-            <w:r/>
-            <w:r>
-              <w:rPr>
-                <w:rFonts w:ascii="Calibri" w:hAnsi="Calibri"/>
-                <w:sz w:val="16"/>
-              </w:rPr>
-              <w:t xml:space="preserve">Dimensional verification per ISO 7176-5 stowed and deployed, then static stability per ISO 7176-1 and dynamic stability per ISO 7176-2 with the awning deployed, across the chair’s rated occupant mass range. Lateral load is then applied by calibrated fan or wind tunnel in 2 m/s increments to confirm the auto-stow threshold actuates below the measured tipping condition, with margin. </w:t>
-            </w:r>
-            <w:r>
-              <w:rPr>
-                <w:rFonts w:ascii="Calibri" w:hAnsi="Calibri"/>
-                <w:i/>
-                <w:sz w:val="16"/>
-              </w:rPr>
-              <w:t>Acceptance:</w:t>
-            </w:r>
-            <w:r>
-              <w:rPr>
-                <w:rFonts w:ascii="Calibri" w:hAnsi="Calibri"/>
-                <w:sz w:val="16"/>
-              </w:rPr>
-              <w:t xml:space="preserve"> stowed envelope unchanged; deployed configuration meets baseline stability limits; auto-stow triggers at or below threshold on 20 of 20 trials.</w:t>
-            </w:r>
-          </w:p>
-        </w:tc>
-      </w:tr>
-      <w:tr>
-        <w:tc>
-          <w:tcPr>
-            <w:tcW w:type="dxa" w:w="864"/>
-          </w:tcPr>
-          <w:p>
-            <w:pPr>
-              <w:spacing w:after="20"/>
-            </w:pPr>
-            <w:r/>
-            <w:r>
-              <w:rPr>
-                <w:rFonts w:ascii="Calibri" w:hAnsi="Calibri"/>
-                <w:b/>
-                <w:sz w:val="16"/>
-              </w:rPr>
-              <w:t>VER-3</w:t>
-            </w:r>
-          </w:p>
-        </w:tc>
-        <w:tc>
-          <w:tcPr>
-            <w:tcW w:type="dxa" w:w="1152"/>
-          </w:tcPr>
-          <w:p>
-            <w:pPr>
-              <w:spacing w:after="20"/>
-            </w:pPr>
-            <w:r/>
-            <w:r>
-              <w:rPr>
-                <w:rFonts w:ascii="Calibri" w:hAnsi="Calibri"/>
-                <w:sz w:val="16"/>
-              </w:rPr>
-              <w:t>DI-3.1</w:t>
-            </w:r>
-          </w:p>
-        </w:tc>
-        <w:tc>
-          <w:tcPr>
-            <w:tcW w:type="dxa" w:w="7848"/>
-          </w:tcPr>
-          <w:p>
-            <w:pPr>
-              <w:spacing w:after="20"/>
-            </w:pPr>
-            <w:r/>
-            <w:r>
-              <w:rPr>
-                <w:rFonts w:ascii="Calibri" w:hAnsi="Calibri"/>
-                <w:sz w:val="16"/>
-              </w:rPr>
-              <w:t>Fabric UPF and hydrostatic head (ISO 811) on three production lots; shade-coverage mapping against a seated anthropometric manikin at solar elevations of 30°, 60°, and 90°; IPX4 spray test per IEC 60529 with the controller powered and logged; climatic conditioning per ISO 7176-9 followed by re-test.</w:t>
-            </w:r>
-          </w:p>
-        </w:tc>
-      </w:tr>
-    </w:tbl>
-    <w:p>
-      <w:pPr>
-        <w:keepNext/>
-        <w:spacing w:before="160" w:after="40"/>
-      </w:pPr>
-      <w:r>
-        <w:rPr>
-          <w:rFonts w:ascii="Calibri" w:hAnsi="Calibri"/>
-          <w:b/>
-          <w:sz w:val="21"/>
-        </w:rPr>
-        <w:t>Phase 5 — Validation (Weeks 55–68) — “did we design the right device?”</w:t>
+        <w:t>Phase 4 — Verification (Weeks 43–54)</w:t>
       </w:r>
     </w:p>
     <w:p>
       <w:pPr>
-        <w:spacing w:after="80"/>
+        <w:spacing w:after="60"/>
         <w:jc w:val="both"/>
       </w:pPr>
       <w:r>
         <w:rPr>
           <w:rFonts w:ascii="Calibri" w:hAnsi="Calibri"/>
-          <w:i/>
         </w:rPr>
-        <w:t>Tasks:</w:t>
-      </w:r>
-      <w:r>
-        <w:rPr>
-          <w:rFonts w:ascii="Calibri" w:hAnsi="Calibri"/>
-        </w:rPr>
-        <w:t xml:space="preserve"> human factors validation with 15 representative users per FDA HFE guidance [9]; a four-week in-home and community use study on production-equivalent units; residual risk–benefit determination. </w:t>
-      </w:r>
-      <w:r>
-        <w:rPr>
-          <w:rFonts w:ascii="Calibri" w:hAnsi="Calibri"/>
-          <w:b/>
-        </w:rPr>
-        <w:t>Validation survey questions</w:t>
-      </w:r>
-      <w:r>
-        <w:rPr>
-          <w:rFonts w:ascii="Calibri" w:hAnsi="Calibri"/>
-        </w:rPr>
-        <w:t xml:space="preserve"> — two worked examples tied to the critical user needs, with the remainder of the instrument built around QUEST 2.0 [10]:</w:t>
+        <w:t>Verification asks whether the device was designed right — whether outputs meet inputs. Two plans carry the critical inputs:</w:t>
       </w:r>
     </w:p>
     <w:p>
@@ -1381,13 +715,13 @@
           <w:rFonts w:ascii="Calibri" w:hAnsi="Calibri"/>
           <w:b/>
         </w:rPr>
-        <w:t>VAL-Q1 (validates UN-1):</w:t>
+        <w:t>VER-1</w:t>
       </w:r>
       <w:r>
         <w:rPr>
           <w:rFonts w:ascii="Calibri" w:hAnsi="Calibri"/>
         </w:rPr>
-        <w:t xml:space="preserve"> “Over the past week, on how many occasions did you open or close the awning, and on how many of those occasions did you need another person’s help?” — followed by the five-point agreement item, “I was able to open and close the awning by myself, quickly enough to matter when the weather changed.” </w:t>
+        <w:t xml:space="preserve"> (verifies DI-1.1 and DI-1.2) — Instrumented actuation testing on 25 production-equivalent units: a force gauge measures peak control force and a timer measures full cycles across the specified temperature range, with a representative-user panel confirming single-handed operation. </w:t>
       </w:r>
       <w:r>
         <w:rPr>
@@ -1400,7 +734,7 @@
         <w:rPr>
           <w:rFonts w:ascii="Calibri" w:hAnsi="Calibri"/>
         </w:rPr>
-        <w:t xml:space="preserve"> ≥ 90% of deployments unassisted and ≥ 80% of participants agreeing or strongly agreeing.</w:t>
+        <w:t xml:space="preserve"> peak force ≤ 22 N and cycle time ≤ 10 s on 100% of units. A 10,000-cycle durability run built on the ISO 7176-8 fatigue philosophy [5] follows, with force and time re-measured at completion and no loss of function permitted.</w:t>
       </w:r>
     </w:p>
     <w:p>
@@ -1415,13 +749,13 @@
           <w:rFonts w:ascii="Calibri" w:hAnsi="Calibri"/>
           <w:b/>
         </w:rPr>
-        <w:t>VAL-Q2 (validates UN-2):</w:t>
+        <w:t>VER-2</w:t>
       </w:r>
       <w:r>
         <w:rPr>
           <w:rFonts w:ascii="Calibri" w:hAnsi="Calibri"/>
         </w:rPr>
-        <w:t xml:space="preserve"> “During the study, did the awning stop you from going anywhere you would normally go — through a doorway, into an elevator, onto a ramp, or into your vehicle? If yes, describe what happened.” — paired with, “Did you at any time feel unsteady, or that the chair might tip, while the awning was open? Describe the circumstances.” </w:t>
+        <w:t xml:space="preserve"> (verifies DI-2.1 and DI-2.2) — Dimensional verification per ISO 7176-5 stowed and deployed, then static and dynamic stability per ISO 7176-1 and ISO 7176-2 with the awning deployed across the rated occupant mass range. Lateral load is then applied by calibrated fan in 2 m/s increments to confirm the auto-stow threshold actuates below the measured tipping condition. Fabric UPF and hydrostatic head (ISO 811) are tested on three production lots, and an IPX4 spray test runs with the controller powered. </w:t>
       </w:r>
       <w:r>
         <w:rPr>
@@ -1434,12 +768,106 @@
         <w:rPr>
           <w:rFonts w:ascii="Calibri" w:hAnsi="Calibri"/>
         </w:rPr>
-        <w:t xml:space="preserve"> no reported access exclusions attributable to the accessory, and zero reports of perceived instability that analysis traces to a real loss of stability margin.</w:t>
+        <w:t xml:space="preserve"> stowed envelope unchanged; baseline stability limits met; auto-stow triggers on 20 of 20 trials; no controller fault.</w:t>
       </w:r>
     </w:p>
     <w:p>
       <w:pPr>
-        <w:spacing w:after="80"/>
+        <w:keepNext/>
+        <w:spacing w:before="100" w:after="40"/>
+      </w:pPr>
+      <w:r>
+        <w:rPr>
+          <w:rFonts w:ascii="Calibri" w:hAnsi="Calibri"/>
+          <w:b/>
+          <w:sz w:val="21"/>
+        </w:rPr>
+        <w:t>Phase 5 — Validation (Weeks 55–68)</w:t>
+      </w:r>
+    </w:p>
+    <w:p>
+      <w:pPr>
+        <w:spacing w:after="60"/>
+        <w:jc w:val="both"/>
+      </w:pPr>
+      <w:r>
+        <w:rPr>
+          <w:rFonts w:ascii="Calibri" w:hAnsi="Calibri"/>
+        </w:rPr>
+        <w:t>Validation asks whether the right device was designed — whether user needs are met in actual use. The plan is a human factors validation with 15 representative users [9] followed by a four-week in-home use study on production-equivalent units, instrumented with the survey below and QUEST 2.0 [10]:</w:t>
+      </w:r>
+    </w:p>
+    <w:p>
+      <w:pPr>
+        <w:pStyle w:val="ListBullet"/>
+        <w:spacing w:after="60"/>
+        <w:ind w:left="403" w:hanging="230"/>
+        <w:jc w:val="both"/>
+      </w:pPr>
+      <w:r>
+        <w:rPr>
+          <w:rFonts w:ascii="Calibri" w:hAnsi="Calibri"/>
+          <w:b/>
+        </w:rPr>
+        <w:t>VAL-Q1</w:t>
+      </w:r>
+      <w:r>
+        <w:rPr>
+          <w:rFonts w:ascii="Calibri" w:hAnsi="Calibri"/>
+        </w:rPr>
+        <w:t xml:space="preserve"> (validates UN-1) — “Over the past week, on how many occasions did you open or close the awning, and on how many of those did you need another person’s help?” followed by the five-point agreement item, “I was able to open and close the awning by myself, quickly enough to matter when the weather changed.” </w:t>
+      </w:r>
+      <w:r>
+        <w:rPr>
+          <w:rFonts w:ascii="Calibri" w:hAnsi="Calibri"/>
+          <w:i/>
+        </w:rPr>
+        <w:t>Acceptance:</w:t>
+      </w:r>
+      <w:r>
+        <w:rPr>
+          <w:rFonts w:ascii="Calibri" w:hAnsi="Calibri"/>
+        </w:rPr>
+        <w:t xml:space="preserve"> at least 90% of deployments unassisted and at least 80% of participants agreeing or strongly agreeing.</w:t>
+      </w:r>
+    </w:p>
+    <w:p>
+      <w:pPr>
+        <w:pStyle w:val="ListBullet"/>
+        <w:spacing w:after="60"/>
+        <w:ind w:left="403" w:hanging="230"/>
+        <w:jc w:val="both"/>
+      </w:pPr>
+      <w:r>
+        <w:rPr>
+          <w:rFonts w:ascii="Calibri" w:hAnsi="Calibri"/>
+          <w:b/>
+        </w:rPr>
+        <w:t>VAL-Q2</w:t>
+      </w:r>
+      <w:r>
+        <w:rPr>
+          <w:rFonts w:ascii="Calibri" w:hAnsi="Calibri"/>
+        </w:rPr>
+        <w:t xml:space="preserve"> (validates UN-2) — “Did the awning stop you from going anywhere you would normally go — through a doorway, into an elevator, onto a ramp, or into your vehicle? If yes, describe what happened.” paired with, “Did you at any time feel unsteady, or that the chair might tip, while the awning was open?” </w:t>
+      </w:r>
+      <w:r>
+        <w:rPr>
+          <w:rFonts w:ascii="Calibri" w:hAnsi="Calibri"/>
+          <w:i/>
+        </w:rPr>
+        <w:t>Acceptance:</w:t>
+      </w:r>
+      <w:r>
+        <w:rPr>
+          <w:rFonts w:ascii="Calibri" w:hAnsi="Calibri"/>
+        </w:rPr>
+        <w:t xml:space="preserve"> no access exclusions attributable to the accessory, and no reports of perceived instability that analysis traces to a real loss of stability margin.</w:t>
+      </w:r>
+    </w:p>
+    <w:p>
+      <w:pPr>
+        <w:spacing w:after="60"/>
         <w:jc w:val="both"/>
       </w:pPr>
       <w:r>
@@ -1447,13 +875,13 @@
           <w:rFonts w:ascii="Calibri" w:hAnsi="Calibri"/>
           <w:i/>
         </w:rPr>
-        <w:t>Design reviews DR-4 and DR-5:</w:t>
+        <w:t>Reviews DR-4 and DR-5</w:t>
       </w:r>
       <w:r>
         <w:rPr>
           <w:rFonts w:ascii="Calibri" w:hAnsi="Calibri"/>
         </w:rPr>
-        <w:t xml:space="preserve"> the full team, clinical advisor, and independent reviewer, presenting verification reports and deviations, the closed traceability matrix, the human factors validation report, use-study results, and the residual risk assessment. </w:t>
+        <w:t xml:space="preserve"> present verification reports and deviations, the closed traceability matrix, the human factors validation report, use-study results, and the residual risk assessment. </w:t>
       </w:r>
       <w:r>
         <w:rPr>
@@ -1466,13 +894,13 @@
         <w:rPr>
           <w:rFonts w:ascii="Calibri" w:hAnsi="Calibri"/>
         </w:rPr>
-        <w:t xml:space="preserve"> all design inputs verified; all user needs validated under actual or simulated use conditions; residual risks judged acceptable against benefit; no unresolved use error of harmful severity.</w:t>
+        <w:t xml:space="preserve"> all inputs verified; all needs validated in actual or simulated use; residual risk acceptable against benefit.</w:t>
       </w:r>
     </w:p>
     <w:p>
       <w:pPr>
         <w:keepNext/>
-        <w:spacing w:before="160" w:after="40"/>
+        <w:spacing w:before="100" w:after="40"/>
       </w:pPr>
       <w:r>
         <w:rPr>
@@ -1485,20 +913,20 @@
     </w:p>
     <w:p>
       <w:pPr>
-        <w:spacing w:after="80"/>
+        <w:spacing w:after="60"/>
         <w:jc w:val="both"/>
       </w:pPr>
       <w:r>
         <w:rPr>
           <w:rFonts w:ascii="Calibri" w:hAnsi="Calibri"/>
         </w:rPr>
-        <w:t>Process validation (IQ/OQ/PQ) on canopy sewing and rib forming, operator training, first-article inspection, final DHF review and design release signature, then commercial launch at Week 72.</w:t>
+        <w:t>Process validation on canopy sewing and rib forming, operator training, first-article inspection, final DHF review and design release signature, then commercial launch at Week 72.</w:t>
       </w:r>
     </w:p>
     <w:p>
       <w:pPr>
         <w:keepNext/>
-        <w:spacing w:before="160" w:after="40"/>
+        <w:spacing w:before="100" w:after="40"/>
       </w:pPr>
       <w:r>
         <w:rPr>
@@ -1509,690 +937,16 @@
         <w:t>Schedule, Milestones, and Critical Path</w:t>
       </w:r>
     </w:p>
-    <w:tbl>
-      <w:tblPr>
-        <w:tblStyle w:val="TableGrid"/>
-        <w:tblW w:type="auto" w:w="0"/>
-        <w:jc w:val="center"/>
-        <w:tblLayout w:type="fixed"/>
-        <w:tblLook w:firstColumn="1" w:firstRow="1" w:lastColumn="0" w:lastRow="0" w:noHBand="0" w:noVBand="1" w:val="04A0"/>
-        <w:tblCellMar>
-          <w:left w:w="45" w:type="dxa"/>
-          <w:right w:w="45" w:type="dxa"/>
-          <w:top w:w="18" w:type="dxa"/>
-          <w:bottom w:w="18" w:type="dxa"/>
-        </w:tblCellMar>
-        <w:tblLayout w:type="fixed"/>
-        <w:tblW w:w="9864" w:type="dxa"/>
-      </w:tblPr>
-      <w:tblGrid>
-        <w:gridCol w:w="2160"/>
-        <w:gridCol w:w="1080"/>
-        <w:gridCol w:w="1224"/>
-        <w:gridCol w:w="5400"/>
-      </w:tblGrid>
-      <w:tr>
-        <w:trPr>
-          <w:tblHeader w:val="true"/>
-        </w:trPr>
-        <w:tc>
-          <w:tcPr>
-            <w:tcW w:type="dxa" w:w="2160"/>
-            <w:shd w:val="clear" w:fill="E8EAED"/>
-          </w:tcPr>
-          <w:p>
-            <w:pPr>
-              <w:spacing w:after="20"/>
-            </w:pPr>
-            <w:r/>
-            <w:r>
-              <w:rPr>
-                <w:rFonts w:ascii="Calibri" w:hAnsi="Calibri"/>
-                <w:b/>
-                <w:sz w:val="16"/>
-              </w:rPr>
-              <w:t>Phase</w:t>
-            </w:r>
-          </w:p>
-        </w:tc>
-        <w:tc>
-          <w:tcPr>
-            <w:tcW w:type="dxa" w:w="1080"/>
-            <w:shd w:val="clear" w:fill="E8EAED"/>
-          </w:tcPr>
-          <w:p>
-            <w:pPr>
-              <w:spacing w:after="20"/>
-            </w:pPr>
-            <w:r/>
-            <w:r>
-              <w:rPr>
-                <w:rFonts w:ascii="Calibri" w:hAnsi="Calibri"/>
-                <w:b/>
-                <w:sz w:val="16"/>
-              </w:rPr>
-              <w:t>Weeks</w:t>
-            </w:r>
-          </w:p>
-        </w:tc>
-        <w:tc>
-          <w:tcPr>
-            <w:tcW w:type="dxa" w:w="1224"/>
-            <w:shd w:val="clear" w:fill="E8EAED"/>
-          </w:tcPr>
-          <w:p>
-            <w:pPr>
-              <w:spacing w:after="20"/>
-            </w:pPr>
-            <w:r/>
-            <w:r>
-              <w:rPr>
-                <w:rFonts w:ascii="Calibri" w:hAnsi="Calibri"/>
-                <w:b/>
-                <w:sz w:val="16"/>
-              </w:rPr>
-              <w:t>Duration</w:t>
-            </w:r>
-          </w:p>
-        </w:tc>
-        <w:tc>
-          <w:tcPr>
-            <w:tcW w:type="dxa" w:w="5400"/>
-            <w:shd w:val="clear" w:fill="E8EAED"/>
-          </w:tcPr>
-          <w:p>
-            <w:pPr>
-              <w:spacing w:after="20"/>
-            </w:pPr>
-            <w:r/>
-            <w:r>
-              <w:rPr>
-                <w:rFonts w:ascii="Calibri" w:hAnsi="Calibri"/>
-                <w:b/>
-                <w:sz w:val="16"/>
-              </w:rPr>
-              <w:t>Milestone / review</w:t>
-            </w:r>
-          </w:p>
-        </w:tc>
-      </w:tr>
-      <w:tr>
-        <w:tc>
-          <w:tcPr>
-            <w:tcW w:type="dxa" w:w="2160"/>
-          </w:tcPr>
-          <w:p>
-            <w:pPr>
-              <w:spacing w:after="20"/>
-            </w:pPr>
-            <w:r/>
-            <w:r>
-              <w:rPr>
-                <w:rFonts w:ascii="Calibri" w:hAnsi="Calibri"/>
-                <w:sz w:val="16"/>
-              </w:rPr>
-              <w:t>0 — User Needs</w:t>
-            </w:r>
-          </w:p>
-        </w:tc>
-        <w:tc>
-          <w:tcPr>
-            <w:tcW w:type="dxa" w:w="1080"/>
-          </w:tcPr>
-          <w:p>
-            <w:pPr>
-              <w:spacing w:after="20"/>
-            </w:pPr>
-            <w:r/>
-            <w:r>
-              <w:rPr>
-                <w:rFonts w:ascii="Calibri" w:hAnsi="Calibri"/>
-                <w:sz w:val="16"/>
-              </w:rPr>
-              <w:t>1–8</w:t>
-            </w:r>
-          </w:p>
-        </w:tc>
-        <w:tc>
-          <w:tcPr>
-            <w:tcW w:type="dxa" w:w="1224"/>
-          </w:tcPr>
-          <w:p>
-            <w:pPr>
-              <w:spacing w:after="20"/>
-            </w:pPr>
-            <w:r/>
-            <w:r>
-              <w:rPr>
-                <w:rFonts w:ascii="Calibri" w:hAnsi="Calibri"/>
-                <w:sz w:val="16"/>
-              </w:rPr>
-              <w:t>8 wk</w:t>
-            </w:r>
-          </w:p>
-        </w:tc>
-        <w:tc>
-          <w:tcPr>
-            <w:tcW w:type="dxa" w:w="5400"/>
-          </w:tcPr>
-          <w:p>
-            <w:pPr>
-              <w:spacing w:after="20"/>
-            </w:pPr>
-            <w:r/>
-            <w:r>
-              <w:rPr>
-                <w:rFonts w:ascii="Calibri" w:hAnsi="Calibri"/>
-                <w:sz w:val="16"/>
-              </w:rPr>
-              <w:t xml:space="preserve">M1: user needs baselined — </w:t>
-            </w:r>
-            <w:r>
-              <w:rPr>
-                <w:rFonts w:ascii="Calibri" w:hAnsi="Calibri"/>
-                <w:b/>
-                <w:sz w:val="16"/>
-              </w:rPr>
-              <w:t>DR-1</w:t>
-            </w:r>
-          </w:p>
-        </w:tc>
-      </w:tr>
-      <w:tr>
-        <w:tc>
-          <w:tcPr>
-            <w:tcW w:type="dxa" w:w="2160"/>
-          </w:tcPr>
-          <w:p>
-            <w:pPr>
-              <w:spacing w:after="20"/>
-            </w:pPr>
-            <w:r/>
-            <w:r>
-              <w:rPr>
-                <w:rFonts w:ascii="Calibri" w:hAnsi="Calibri"/>
-                <w:sz w:val="16"/>
-              </w:rPr>
-              <w:t>1 — Design Input</w:t>
-            </w:r>
-          </w:p>
-        </w:tc>
-        <w:tc>
-          <w:tcPr>
-            <w:tcW w:type="dxa" w:w="1080"/>
-          </w:tcPr>
-          <w:p>
-            <w:pPr>
-              <w:spacing w:after="20"/>
-            </w:pPr>
-            <w:r/>
-            <w:r>
-              <w:rPr>
-                <w:rFonts w:ascii="Calibri" w:hAnsi="Calibri"/>
-                <w:sz w:val="16"/>
-              </w:rPr>
-              <w:t>9–18</w:t>
-            </w:r>
-          </w:p>
-        </w:tc>
-        <w:tc>
-          <w:tcPr>
-            <w:tcW w:type="dxa" w:w="1224"/>
-          </w:tcPr>
-          <w:p>
-            <w:pPr>
-              <w:spacing w:after="20"/>
-            </w:pPr>
-            <w:r/>
-            <w:r>
-              <w:rPr>
-                <w:rFonts w:ascii="Calibri" w:hAnsi="Calibri"/>
-                <w:sz w:val="16"/>
-              </w:rPr>
-              <w:t>10 wk</w:t>
-            </w:r>
-          </w:p>
-        </w:tc>
-        <w:tc>
-          <w:tcPr>
-            <w:tcW w:type="dxa" w:w="5400"/>
-          </w:tcPr>
-          <w:p>
-            <w:pPr>
-              <w:spacing w:after="20"/>
-            </w:pPr>
-            <w:r/>
-            <w:r>
-              <w:rPr>
-                <w:rFonts w:ascii="Calibri" w:hAnsi="Calibri"/>
-                <w:sz w:val="16"/>
-              </w:rPr>
-              <w:t xml:space="preserve">M2: PDS and requirements baselined — </w:t>
-            </w:r>
-            <w:r>
-              <w:rPr>
-                <w:rFonts w:ascii="Calibri" w:hAnsi="Calibri"/>
-                <w:b/>
-                <w:sz w:val="16"/>
-              </w:rPr>
-              <w:t>DR-2</w:t>
-            </w:r>
-          </w:p>
-        </w:tc>
-      </w:tr>
-      <w:tr>
-        <w:tc>
-          <w:tcPr>
-            <w:tcW w:type="dxa" w:w="2160"/>
-          </w:tcPr>
-          <w:p>
-            <w:pPr>
-              <w:spacing w:after="20"/>
-            </w:pPr>
-            <w:r/>
-            <w:r>
-              <w:rPr>
-                <w:rFonts w:ascii="Calibri" w:hAnsi="Calibri"/>
-                <w:sz w:val="16"/>
-              </w:rPr>
-              <w:t>2 — Design Process</w:t>
-            </w:r>
-          </w:p>
-        </w:tc>
-        <w:tc>
-          <w:tcPr>
-            <w:tcW w:type="dxa" w:w="1080"/>
-          </w:tcPr>
-          <w:p>
-            <w:pPr>
-              <w:spacing w:after="20"/>
-            </w:pPr>
-            <w:r/>
-            <w:r>
-              <w:rPr>
-                <w:rFonts w:ascii="Calibri" w:hAnsi="Calibri"/>
-                <w:sz w:val="16"/>
-              </w:rPr>
-              <w:t>19–34</w:t>
-            </w:r>
-          </w:p>
-        </w:tc>
-        <w:tc>
-          <w:tcPr>
-            <w:tcW w:type="dxa" w:w="1224"/>
-          </w:tcPr>
-          <w:p>
-            <w:pPr>
-              <w:spacing w:after="20"/>
-            </w:pPr>
-            <w:r/>
-            <w:r>
-              <w:rPr>
-                <w:rFonts w:ascii="Calibri" w:hAnsi="Calibri"/>
-                <w:sz w:val="16"/>
-              </w:rPr>
-              <w:t>16 wk</w:t>
-            </w:r>
-          </w:p>
-        </w:tc>
-        <w:tc>
-          <w:tcPr>
-            <w:tcW w:type="dxa" w:w="5400"/>
-          </w:tcPr>
-          <w:p>
-            <w:pPr>
-              <w:spacing w:after="20"/>
-            </w:pPr>
-            <w:r/>
-            <w:r>
-              <w:rPr>
-                <w:rFonts w:ascii="Calibri" w:hAnsi="Calibri"/>
-                <w:sz w:val="16"/>
-              </w:rPr>
-              <w:t xml:space="preserve">M3: concept selected (Wk 26), design freeze (Wk 34) — </w:t>
-            </w:r>
-            <w:r>
-              <w:rPr>
-                <w:rFonts w:ascii="Calibri" w:hAnsi="Calibri"/>
-                <w:b/>
-                <w:sz w:val="16"/>
-              </w:rPr>
-              <w:t>DR-2b</w:t>
-            </w:r>
-          </w:p>
-        </w:tc>
-      </w:tr>
-      <w:tr>
-        <w:tc>
-          <w:tcPr>
-            <w:tcW w:type="dxa" w:w="2160"/>
-          </w:tcPr>
-          <w:p>
-            <w:pPr>
-              <w:spacing w:after="20"/>
-            </w:pPr>
-            <w:r/>
-            <w:r>
-              <w:rPr>
-                <w:rFonts w:ascii="Calibri" w:hAnsi="Calibri"/>
-                <w:sz w:val="16"/>
-              </w:rPr>
-              <w:t>3 — Design Output</w:t>
-            </w:r>
-          </w:p>
-        </w:tc>
-        <w:tc>
-          <w:tcPr>
-            <w:tcW w:type="dxa" w:w="1080"/>
-          </w:tcPr>
-          <w:p>
-            <w:pPr>
-              <w:spacing w:after="20"/>
-            </w:pPr>
-            <w:r/>
-            <w:r>
-              <w:rPr>
-                <w:rFonts w:ascii="Calibri" w:hAnsi="Calibri"/>
-                <w:sz w:val="16"/>
-              </w:rPr>
-              <w:t>31–42</w:t>
-            </w:r>
-          </w:p>
-        </w:tc>
-        <w:tc>
-          <w:tcPr>
-            <w:tcW w:type="dxa" w:w="1224"/>
-          </w:tcPr>
-          <w:p>
-            <w:pPr>
-              <w:spacing w:after="20"/>
-            </w:pPr>
-            <w:r/>
-            <w:r>
-              <w:rPr>
-                <w:rFonts w:ascii="Calibri" w:hAnsi="Calibri"/>
-                <w:sz w:val="16"/>
-              </w:rPr>
-              <w:t>12 wk</w:t>
-            </w:r>
-          </w:p>
-        </w:tc>
-        <w:tc>
-          <w:tcPr>
-            <w:tcW w:type="dxa" w:w="5400"/>
-          </w:tcPr>
-          <w:p>
-            <w:pPr>
-              <w:spacing w:after="20"/>
-            </w:pPr>
-            <w:r/>
-            <w:r>
-              <w:rPr>
-                <w:rFonts w:ascii="Calibri" w:hAnsi="Calibri"/>
-                <w:sz w:val="16"/>
-              </w:rPr>
-              <w:t xml:space="preserve">M4: outputs released, protocols approved — </w:t>
-            </w:r>
-            <w:r>
-              <w:rPr>
-                <w:rFonts w:ascii="Calibri" w:hAnsi="Calibri"/>
-                <w:b/>
-                <w:sz w:val="16"/>
-              </w:rPr>
-              <w:t>DR-3</w:t>
-            </w:r>
-          </w:p>
-        </w:tc>
-      </w:tr>
-      <w:tr>
-        <w:tc>
-          <w:tcPr>
-            <w:tcW w:type="dxa" w:w="2160"/>
-          </w:tcPr>
-          <w:p>
-            <w:pPr>
-              <w:spacing w:after="20"/>
-            </w:pPr>
-            <w:r/>
-            <w:r>
-              <w:rPr>
-                <w:rFonts w:ascii="Calibri" w:hAnsi="Calibri"/>
-                <w:sz w:val="16"/>
-              </w:rPr>
-              <w:t>4 — Verification</w:t>
-            </w:r>
-          </w:p>
-        </w:tc>
-        <w:tc>
-          <w:tcPr>
-            <w:tcW w:type="dxa" w:w="1080"/>
-          </w:tcPr>
-          <w:p>
-            <w:pPr>
-              <w:spacing w:after="20"/>
-            </w:pPr>
-            <w:r/>
-            <w:r>
-              <w:rPr>
-                <w:rFonts w:ascii="Calibri" w:hAnsi="Calibri"/>
-                <w:sz w:val="16"/>
-              </w:rPr>
-              <w:t>43–54</w:t>
-            </w:r>
-          </w:p>
-        </w:tc>
-        <w:tc>
-          <w:tcPr>
-            <w:tcW w:type="dxa" w:w="1224"/>
-          </w:tcPr>
-          <w:p>
-            <w:pPr>
-              <w:spacing w:after="20"/>
-            </w:pPr>
-            <w:r/>
-            <w:r>
-              <w:rPr>
-                <w:rFonts w:ascii="Calibri" w:hAnsi="Calibri"/>
-                <w:sz w:val="16"/>
-              </w:rPr>
-              <w:t>12 wk</w:t>
-            </w:r>
-          </w:p>
-        </w:tc>
-        <w:tc>
-          <w:tcPr>
-            <w:tcW w:type="dxa" w:w="5400"/>
-          </w:tcPr>
-          <w:p>
-            <w:pPr>
-              <w:spacing w:after="20"/>
-            </w:pPr>
-            <w:r/>
-            <w:r>
-              <w:rPr>
-                <w:rFonts w:ascii="Calibri" w:hAnsi="Calibri"/>
-                <w:sz w:val="16"/>
-              </w:rPr>
-              <w:t xml:space="preserve">M5: verification complete — </w:t>
-            </w:r>
-            <w:r>
-              <w:rPr>
-                <w:rFonts w:ascii="Calibri" w:hAnsi="Calibri"/>
-                <w:b/>
-                <w:sz w:val="16"/>
-              </w:rPr>
-              <w:t>DR-4</w:t>
-            </w:r>
-          </w:p>
-        </w:tc>
-      </w:tr>
-      <w:tr>
-        <w:tc>
-          <w:tcPr>
-            <w:tcW w:type="dxa" w:w="2160"/>
-          </w:tcPr>
-          <w:p>
-            <w:pPr>
-              <w:spacing w:after="20"/>
-            </w:pPr>
-            <w:r/>
-            <w:r>
-              <w:rPr>
-                <w:rFonts w:ascii="Calibri" w:hAnsi="Calibri"/>
-                <w:sz w:val="16"/>
-              </w:rPr>
-              <w:t>5 — Validation</w:t>
-            </w:r>
-          </w:p>
-        </w:tc>
-        <w:tc>
-          <w:tcPr>
-            <w:tcW w:type="dxa" w:w="1080"/>
-          </w:tcPr>
-          <w:p>
-            <w:pPr>
-              <w:spacing w:after="20"/>
-            </w:pPr>
-            <w:r/>
-            <w:r>
-              <w:rPr>
-                <w:rFonts w:ascii="Calibri" w:hAnsi="Calibri"/>
-                <w:sz w:val="16"/>
-              </w:rPr>
-              <w:t>55–68</w:t>
-            </w:r>
-          </w:p>
-        </w:tc>
-        <w:tc>
-          <w:tcPr>
-            <w:tcW w:type="dxa" w:w="1224"/>
-          </w:tcPr>
-          <w:p>
-            <w:pPr>
-              <w:spacing w:after="20"/>
-            </w:pPr>
-            <w:r/>
-            <w:r>
-              <w:rPr>
-                <w:rFonts w:ascii="Calibri" w:hAnsi="Calibri"/>
-                <w:sz w:val="16"/>
-              </w:rPr>
-              <w:t>14 wk</w:t>
-            </w:r>
-          </w:p>
-        </w:tc>
-        <w:tc>
-          <w:tcPr>
-            <w:tcW w:type="dxa" w:w="5400"/>
-          </w:tcPr>
-          <w:p>
-            <w:pPr>
-              <w:spacing w:after="20"/>
-            </w:pPr>
-            <w:r/>
-            <w:r>
-              <w:rPr>
-                <w:rFonts w:ascii="Calibri" w:hAnsi="Calibri"/>
-                <w:sz w:val="16"/>
-              </w:rPr>
-              <w:t xml:space="preserve">M6: validation complete — </w:t>
-            </w:r>
-            <w:r>
-              <w:rPr>
-                <w:rFonts w:ascii="Calibri" w:hAnsi="Calibri"/>
-                <w:b/>
-                <w:sz w:val="16"/>
-              </w:rPr>
-              <w:t>DR-5</w:t>
-            </w:r>
-          </w:p>
-        </w:tc>
-      </w:tr>
-      <w:tr>
-        <w:tc>
-          <w:tcPr>
-            <w:tcW w:type="dxa" w:w="2160"/>
-          </w:tcPr>
-          <w:p>
-            <w:pPr>
-              <w:spacing w:after="20"/>
-            </w:pPr>
-            <w:r/>
-            <w:r>
-              <w:rPr>
-                <w:rFonts w:ascii="Calibri" w:hAnsi="Calibri"/>
-                <w:sz w:val="16"/>
-              </w:rPr>
-              <w:t>6 — Design Transfer</w:t>
-            </w:r>
-          </w:p>
-        </w:tc>
-        <w:tc>
-          <w:tcPr>
-            <w:tcW w:type="dxa" w:w="1080"/>
-          </w:tcPr>
-          <w:p>
-            <w:pPr>
-              <w:spacing w:after="20"/>
-            </w:pPr>
-            <w:r/>
-            <w:r>
-              <w:rPr>
-                <w:rFonts w:ascii="Calibri" w:hAnsi="Calibri"/>
-                <w:sz w:val="16"/>
-              </w:rPr>
-              <w:t>63–72</w:t>
-            </w:r>
-          </w:p>
-        </w:tc>
-        <w:tc>
-          <w:tcPr>
-            <w:tcW w:type="dxa" w:w="1224"/>
-          </w:tcPr>
-          <w:p>
-            <w:pPr>
-              <w:spacing w:after="20"/>
-            </w:pPr>
-            <w:r/>
-            <w:r>
-              <w:rPr>
-                <w:rFonts w:ascii="Calibri" w:hAnsi="Calibri"/>
-                <w:sz w:val="16"/>
-              </w:rPr>
-              <w:t>10 wk</w:t>
-            </w:r>
-          </w:p>
-        </w:tc>
-        <w:tc>
-          <w:tcPr>
-            <w:tcW w:type="dxa" w:w="5400"/>
-          </w:tcPr>
-          <w:p>
-            <w:pPr>
-              <w:spacing w:after="20"/>
-            </w:pPr>
-            <w:r/>
-            <w:r>
-              <w:rPr>
-                <w:rFonts w:ascii="Calibri" w:hAnsi="Calibri"/>
-                <w:sz w:val="16"/>
-              </w:rPr>
-              <w:t>M7: design release and commercial launch</w:t>
-            </w:r>
-          </w:p>
-        </w:tc>
-      </w:tr>
-    </w:tbl>
     <w:p>
       <w:pPr>
-        <w:spacing w:after="80"/>
+        <w:spacing w:after="60"/>
         <w:jc w:val="both"/>
       </w:pPr>
       <w:r>
         <w:rPr>
           <w:rFonts w:ascii="Calibri" w:hAnsi="Calibri"/>
         </w:rPr>
-        <w:t xml:space="preserve">Total duration is roughly 72 weeks, or 16 to 17 months. The </w:t>
+        <w:t xml:space="preserve">The seven phases run to roughly 72 weeks, or 16 to 17 months. Milestones close each phase: M1 user needs baselined at Week 8, M2 requirements and PDS baselined at Week 18, M3 concept selected at Week 26 and design frozen at Week 34, M4 outputs released at Week 42, M5 verification complete at Week 54, M6 validation complete at Week 68, and M7 design release at Week 72. The </w:t>
       </w:r>
       <w:r>
         <w:rPr>
@@ -2205,13 +959,13 @@
         <w:rPr>
           <w:rFonts w:ascii="Calibri" w:hAnsi="Calibri"/>
         </w:rPr>
-        <w:t xml:space="preserve"> runs: user needs → wind-load and stability analysis (TA-1, which sets the auto-stow requirement and therefore the actuator specification) → actuator procurement (12–14 week lead) → output release → the 10,000-cycle durability run, which is roughly six weeks of continuous testing and cannot be compressed → validation. Two items are started deliberately early because they are long-lead and easy to underestimate: injection tooling for the rib and hub components (12–16 weeks, released at M4), and IRB approval for the home-use study, submitted during Phase 3 rather than Phase 5 because an 8–10 week review would otherwise land directly on the critical path. Roughly four weeks of float is carried in Phase 2 to absorb a failed concept screen, which is the most likely single source of schedule loss.</w:t>
+        <w:t xml:space="preserve"> runs from user needs through the wind-load and stability analysis of TA-1 — which sets the auto-stow requirement and therefore the actuator specification — into actuator procurement at a 12 to 14 week lead, then output release, then the 10,000-cycle durability run, roughly six weeks of continuous testing that cannot be compressed, and finally validation. Two long-lead items start early: injection tooling for the rib and hub components at 12 to 16 weeks, and IRB approval for the home-use study, submitted during Phase 3 because an eight to ten week review would otherwise land on the critical path. Four weeks of float in Phase 2 absorbs a failed concept screen, the likeliest source of schedule loss.</w:t>
       </w:r>
     </w:p>
     <w:p>
       <w:pPr>
         <w:keepNext/>
-        <w:spacing w:before="200" w:after="40"/>
+        <w:spacing w:before="180" w:after="40"/>
         <w:pBdr>
           <w:bottom w:val="single" w:sz="6" w:space="1" w:color="888888"/>
         </w:pBdr>
@@ -2279,7 +1033,7 @@
           <w:rFonts w:ascii="Calibri" w:hAnsi="Calibri"/>
           <w:sz w:val="19"/>
         </w:rPr>
-        <w:t>, Title 21, Part 820.30 — Design Controls. U.S. Government Publishing Office. (Part 820 has been amended by FDA’s Quality Management System Regulation, which incorporates ISO 13485:2016 by reference; design control requirements map to ISO 13485 clause 7.3.)</w:t>
+        <w:t>, Title 21, Part 820.30 — Design Controls. U.S. Government Publishing Office.</w:t>
       </w:r>
     </w:p>
     <w:p>
@@ -2363,7 +1117,7 @@
           <w:rFonts w:ascii="Calibri" w:hAnsi="Calibri"/>
           <w:sz w:val="19"/>
         </w:rPr>
-        <w:t xml:space="preserve"> — in particular Part 1 (determination of static stability), Part 2 (determination of dynamic stability of electric wheelchairs), Part 4 (energy consumption and theoretical distance range), Part 5 (determination of dimensions, mass and manoeuvring space), Part 8 (requirements and test methods for static, impact and fatigue strengths), Part 9 (climatic tests), Part 14 (power and control systems), Part 19 (wheeled mobility devices for use as seats in motor vehicles), and Part 21 (electromagnetic compatibility). Geneva: ISO.</w:t>
+        <w:t xml:space="preserve"> — in particular Part 1 (static stability), Part 2 (dynamic stability of electric wheelchairs), Part 5 (dimensions, mass and manoeuvring space), and Part 8 (static, impact and fatigue strengths). Geneva: ISO.</w:t>
       </w:r>
     </w:p>
     <w:p>
@@ -2504,34 +1258,6 @@
           <w:sz w:val="19"/>
         </w:rPr>
         <w:t>, vol. 14, no. 3, pp. 101–105, 2002.</w:t>
-      </w:r>
-    </w:p>
-    <w:p>
-      <w:pPr>
-        <w:spacing w:after="60"/>
-        <w:ind w:left="432" w:hanging="432"/>
-      </w:pPr>
-      <w:r>
-        <w:rPr>
-          <w:rFonts w:ascii="Calibri" w:hAnsi="Calibri"/>
-          <w:sz w:val="19"/>
-        </w:rPr>
-        <w:t xml:space="preserve">[11] U.S. Food and Drug Administration, </w:t>
-      </w:r>
-      <w:r>
-        <w:rPr>
-          <w:rFonts w:ascii="Calibri" w:hAnsi="Calibri"/>
-          <w:i/>
-          <w:sz w:val="19"/>
-        </w:rPr>
-        <w:t>Deciding When to Submit a 510(k) for a Change to an Existing Device: Guidance for Industry and Food and Drug Administration Staff</w:t>
-      </w:r>
-      <w:r>
-        <w:rPr>
-          <w:rFonts w:ascii="Calibri" w:hAnsi="Calibri"/>
-          <w:sz w:val="19"/>
-        </w:rPr>
-        <w:t>. October 25, 2017.</w:t>
       </w:r>
     </w:p>
     <w:sectPr>
@@ -2908,7 +1634,7 @@
     <w:qFormat/>
     <w:rsid w:val="00FC693F"/>
     <w:pPr>
-      <w:spacing w:after="80" w:before="0" w:line="240" w:lineRule="auto"/>
+      <w:spacing w:after="60" w:before="0" w:line="240" w:lineRule="auto"/>
     </w:pPr>
     <w:rPr>
       <w:rFonts w:ascii="Calibri" w:hAnsi="Calibri"/>

</xml_diff>